<commit_message>
Configuracion y Administracion del espacio en disco (Reparado).docx
</commit_message>
<xml_diff>
--- a/Configuracion y Administracion del espacio en disco2 (Reparado).docx
+++ b/Configuracion y Administracion del espacio en disco2 (Reparado).docx
@@ -428,7 +428,7 @@
           <w:r>
             <w:fldChar w:fldCharType="separate"/>
           </w:r>
-          <w:hyperlink w:anchor="_Toc224899878" w:history="1">
+          <w:hyperlink w:anchor="_Toc225185311" w:history="1">
             <w:r>
               <w:rPr>
                 <w:rStyle w:val="Hipervnculo"/>
@@ -455,7 +455,7 @@
                 <w:noProof/>
                 <w:webHidden/>
               </w:rPr>
-              <w:instrText xml:space="preserve"> PAGEREF _Toc224899878 \h </w:instrText>
+              <w:instrText xml:space="preserve"> PAGEREF _Toc225185311 \h </w:instrText>
             </w:r>
             <w:r>
               <w:rPr>
@@ -499,7 +499,7 @@
               <w14:ligatures w14:val="standardContextual"/>
             </w:rPr>
           </w:pPr>
-          <w:hyperlink w:anchor="_Toc224899879" w:history="1">
+          <w:hyperlink w:anchor="_Toc225185312" w:history="1">
             <w:r>
               <w:rPr>
                 <w:rStyle w:val="Hipervnculo"/>
@@ -526,7 +526,7 @@
                 <w:noProof/>
                 <w:webHidden/>
               </w:rPr>
-              <w:instrText xml:space="preserve"> PAGEREF _Toc224899879 \h </w:instrText>
+              <w:instrText xml:space="preserve"> PAGEREF _Toc225185312 \h </w:instrText>
             </w:r>
             <w:r>
               <w:rPr>
@@ -570,7 +570,7 @@
               <w14:ligatures w14:val="standardContextual"/>
             </w:rPr>
           </w:pPr>
-          <w:hyperlink w:anchor="_Toc224899880" w:history="1">
+          <w:hyperlink w:anchor="_Toc225185313" w:history="1">
             <w:r>
               <w:rPr>
                 <w:rStyle w:val="Hipervnculo"/>
@@ -597,7 +597,7 @@
                 <w:noProof/>
                 <w:webHidden/>
               </w:rPr>
-              <w:instrText xml:space="preserve"> PAGEREF _Toc224899880 \h </w:instrText>
+              <w:instrText xml:space="preserve"> PAGEREF _Toc225185313 \h </w:instrText>
             </w:r>
             <w:r>
               <w:rPr>
@@ -641,7 +641,7 @@
               <w14:ligatures w14:val="standardContextual"/>
             </w:rPr>
           </w:pPr>
-          <w:hyperlink w:anchor="_Toc224899881" w:history="1">
+          <w:hyperlink w:anchor="_Toc225185314" w:history="1">
             <w:r>
               <w:rPr>
                 <w:rStyle w:val="Hipervnculo"/>
@@ -668,7 +668,7 @@
                 <w:noProof/>
                 <w:webHidden/>
               </w:rPr>
-              <w:instrText xml:space="preserve"> PAGEREF _Toc224899881 \h </w:instrText>
+              <w:instrText xml:space="preserve"> PAGEREF _Toc225185314 \h </w:instrText>
             </w:r>
             <w:r>
               <w:rPr>
@@ -712,7 +712,7 @@
               <w14:ligatures w14:val="standardContextual"/>
             </w:rPr>
           </w:pPr>
-          <w:hyperlink w:anchor="_Toc224899882" w:history="1">
+          <w:hyperlink w:anchor="_Toc225185315" w:history="1">
             <w:r>
               <w:rPr>
                 <w:rStyle w:val="Hipervnculo"/>
@@ -739,7 +739,7 @@
                 <w:noProof/>
                 <w:webHidden/>
               </w:rPr>
-              <w:instrText xml:space="preserve"> PAGEREF _Toc224899882 \h </w:instrText>
+              <w:instrText xml:space="preserve"> PAGEREF _Toc225185315 \h </w:instrText>
             </w:r>
             <w:r>
               <w:rPr>
@@ -783,7 +783,7 @@
               <w14:ligatures w14:val="standardContextual"/>
             </w:rPr>
           </w:pPr>
-          <w:hyperlink w:anchor="_Toc224899883" w:history="1">
+          <w:hyperlink w:anchor="_Toc225185316" w:history="1">
             <w:r>
               <w:rPr>
                 <w:rStyle w:val="Hipervnculo"/>
@@ -810,7 +810,7 @@
                 <w:noProof/>
                 <w:webHidden/>
               </w:rPr>
-              <w:instrText xml:space="preserve"> PAGEREF _Toc224899883 \h </w:instrText>
+              <w:instrText xml:space="preserve"> PAGEREF _Toc225185316 \h </w:instrText>
             </w:r>
             <w:r>
               <w:rPr>
@@ -854,7 +854,7 @@
               <w14:ligatures w14:val="standardContextual"/>
             </w:rPr>
           </w:pPr>
-          <w:hyperlink w:anchor="_Toc224899884" w:history="1">
+          <w:hyperlink w:anchor="_Toc225185317" w:history="1">
             <w:r>
               <w:rPr>
                 <w:rStyle w:val="Hipervnculo"/>
@@ -881,7 +881,7 @@
                 <w:noProof/>
                 <w:webHidden/>
               </w:rPr>
-              <w:instrText xml:space="preserve"> PAGEREF _Toc224899884 \h </w:instrText>
+              <w:instrText xml:space="preserve"> PAGEREF _Toc225185317 \h </w:instrText>
             </w:r>
             <w:r>
               <w:rPr>
@@ -925,7 +925,7 @@
               <w14:ligatures w14:val="standardContextual"/>
             </w:rPr>
           </w:pPr>
-          <w:hyperlink w:anchor="_Toc224899885" w:history="1">
+          <w:hyperlink w:anchor="_Toc225185318" w:history="1">
             <w:r>
               <w:rPr>
                 <w:rStyle w:val="Hipervnculo"/>
@@ -952,7 +952,7 @@
                 <w:noProof/>
                 <w:webHidden/>
               </w:rPr>
-              <w:instrText xml:space="preserve"> PAGEREF _Toc224899885 \h </w:instrText>
+              <w:instrText xml:space="preserve"> PAGEREF _Toc225185318 \h </w:instrText>
             </w:r>
             <w:r>
               <w:rPr>
@@ -996,7 +996,7 @@
               <w14:ligatures w14:val="standardContextual"/>
             </w:rPr>
           </w:pPr>
-          <w:hyperlink w:anchor="_Toc224899886" w:history="1">
+          <w:hyperlink w:anchor="_Toc225185319" w:history="1">
             <w:r>
               <w:rPr>
                 <w:rStyle w:val="Hipervnculo"/>
@@ -1023,7 +1023,7 @@
                 <w:noProof/>
                 <w:webHidden/>
               </w:rPr>
-              <w:instrText xml:space="preserve"> PAGEREF _Toc224899886 \h </w:instrText>
+              <w:instrText xml:space="preserve"> PAGEREF _Toc225185319 \h </w:instrText>
             </w:r>
             <w:r>
               <w:rPr>
@@ -1067,7 +1067,7 @@
               <w14:ligatures w14:val="standardContextual"/>
             </w:rPr>
           </w:pPr>
-          <w:hyperlink w:anchor="_Toc224899887" w:history="1">
+          <w:hyperlink w:anchor="_Toc225185320" w:history="1">
             <w:r>
               <w:rPr>
                 <w:rStyle w:val="Hipervnculo"/>
@@ -1094,7 +1094,7 @@
                 <w:noProof/>
                 <w:webHidden/>
               </w:rPr>
-              <w:instrText xml:space="preserve"> PAGEREF _Toc224899887 \h </w:instrText>
+              <w:instrText xml:space="preserve"> PAGEREF _Toc225185320 \h </w:instrText>
             </w:r>
             <w:r>
               <w:rPr>
@@ -1138,7 +1138,7 @@
               <w14:ligatures w14:val="standardContextual"/>
             </w:rPr>
           </w:pPr>
-          <w:hyperlink w:anchor="_Toc224899888" w:history="1">
+          <w:hyperlink w:anchor="_Toc225185321" w:history="1">
             <w:r>
               <w:rPr>
                 <w:rStyle w:val="Hipervnculo"/>
@@ -1165,7 +1165,7 @@
                 <w:noProof/>
                 <w:webHidden/>
               </w:rPr>
-              <w:instrText xml:space="preserve"> PAGEREF _Toc224899888 \h </w:instrText>
+              <w:instrText xml:space="preserve"> PAGEREF _Toc225185321 \h </w:instrText>
             </w:r>
             <w:r>
               <w:rPr>
@@ -1209,7 +1209,7 @@
               <w14:ligatures w14:val="standardContextual"/>
             </w:rPr>
           </w:pPr>
-          <w:hyperlink w:anchor="_Toc224899889" w:history="1">
+          <w:hyperlink w:anchor="_Toc225185322" w:history="1">
             <w:r>
               <w:rPr>
                 <w:rStyle w:val="Hipervnculo"/>
@@ -1236,7 +1236,7 @@
                 <w:noProof/>
                 <w:webHidden/>
               </w:rPr>
-              <w:instrText xml:space="preserve"> PAGEREF _Toc224899889 \h </w:instrText>
+              <w:instrText xml:space="preserve"> PAGEREF _Toc225185322 \h </w:instrText>
             </w:r>
             <w:r>
               <w:rPr>
@@ -1280,7 +1280,7 @@
               <w14:ligatures w14:val="standardContextual"/>
             </w:rPr>
           </w:pPr>
-          <w:hyperlink w:anchor="_Toc224899890" w:history="1">
+          <w:hyperlink w:anchor="_Toc225185323" w:history="1">
             <w:r>
               <w:rPr>
                 <w:rStyle w:val="Hipervnculo"/>
@@ -1307,7 +1307,7 @@
                 <w:noProof/>
                 <w:webHidden/>
               </w:rPr>
-              <w:instrText xml:space="preserve"> PAGEREF _Toc224899890 \h </w:instrText>
+              <w:instrText xml:space="preserve"> PAGEREF _Toc225185323 \h </w:instrText>
             </w:r>
             <w:r>
               <w:rPr>
@@ -1328,6 +1328,1570 @@
                 <w:webHidden/>
               </w:rPr>
               <w:t>9</w:t>
+            </w:r>
+            <w:r>
+              <w:rPr>
+                <w:noProof/>
+                <w:webHidden/>
+              </w:rPr>
+              <w:fldChar w:fldCharType="end"/>
+            </w:r>
+          </w:hyperlink>
+        </w:p>
+        <w:p>
+          <w:pPr>
+            <w:pStyle w:val="TDC2"/>
+            <w:tabs>
+              <w:tab w:val="right" w:leader="dot" w:pos="8828"/>
+            </w:tabs>
+            <w:rPr>
+              <w:rFonts w:asciiTheme="minorHAnsi" w:eastAsiaTheme="minorEastAsia" w:hAnsiTheme="minorHAnsi" w:cstheme="minorBidi"/>
+              <w:noProof/>
+              <w:kern w:val="2"/>
+              <w14:ligatures w14:val="standardContextual"/>
+            </w:rPr>
+          </w:pPr>
+          <w:hyperlink w:anchor="_Toc225185324" w:history="1">
+            <w:r>
+              <w:rPr>
+                <w:rStyle w:val="Hipervnculo"/>
+                <w:rFonts w:eastAsia="Times New Roman"/>
+                <w:noProof/>
+              </w:rPr>
+              <w:t>1. Creación de tablespace generales:</w:t>
+            </w:r>
+            <w:r>
+              <w:rPr>
+                <w:noProof/>
+                <w:webHidden/>
+              </w:rPr>
+              <w:tab/>
+            </w:r>
+            <w:r>
+              <w:rPr>
+                <w:noProof/>
+                <w:webHidden/>
+              </w:rPr>
+              <w:fldChar w:fldCharType="begin"/>
+            </w:r>
+            <w:r>
+              <w:rPr>
+                <w:noProof/>
+                <w:webHidden/>
+              </w:rPr>
+              <w:instrText xml:space="preserve"> PAGEREF _Toc225185324 \h </w:instrText>
+            </w:r>
+            <w:r>
+              <w:rPr>
+                <w:noProof/>
+                <w:webHidden/>
+              </w:rPr>
+            </w:r>
+            <w:r>
+              <w:rPr>
+                <w:noProof/>
+                <w:webHidden/>
+              </w:rPr>
+              <w:fldChar w:fldCharType="separate"/>
+            </w:r>
+            <w:r>
+              <w:rPr>
+                <w:noProof/>
+                <w:webHidden/>
+              </w:rPr>
+              <w:t>9</w:t>
+            </w:r>
+            <w:r>
+              <w:rPr>
+                <w:noProof/>
+                <w:webHidden/>
+              </w:rPr>
+              <w:fldChar w:fldCharType="end"/>
+            </w:r>
+          </w:hyperlink>
+        </w:p>
+        <w:p>
+          <w:pPr>
+            <w:pStyle w:val="TDC2"/>
+            <w:tabs>
+              <w:tab w:val="right" w:leader="dot" w:pos="8828"/>
+            </w:tabs>
+            <w:rPr>
+              <w:rFonts w:asciiTheme="minorHAnsi" w:eastAsiaTheme="minorEastAsia" w:hAnsiTheme="minorHAnsi" w:cstheme="minorBidi"/>
+              <w:noProof/>
+              <w:kern w:val="2"/>
+              <w14:ligatures w14:val="standardContextual"/>
+            </w:rPr>
+          </w:pPr>
+          <w:hyperlink w:anchor="_Toc225185325" w:history="1">
+            <w:r>
+              <w:rPr>
+                <w:rStyle w:val="Hipervnculo"/>
+                <w:noProof/>
+              </w:rPr>
+              <w:t>2. Creación y configuración de la base de datos</w:t>
+            </w:r>
+            <w:r>
+              <w:rPr>
+                <w:noProof/>
+                <w:webHidden/>
+              </w:rPr>
+              <w:tab/>
+            </w:r>
+            <w:r>
+              <w:rPr>
+                <w:noProof/>
+                <w:webHidden/>
+              </w:rPr>
+              <w:fldChar w:fldCharType="begin"/>
+            </w:r>
+            <w:r>
+              <w:rPr>
+                <w:noProof/>
+                <w:webHidden/>
+              </w:rPr>
+              <w:instrText xml:space="preserve"> PAGEREF _Toc225185325 \h </w:instrText>
+            </w:r>
+            <w:r>
+              <w:rPr>
+                <w:noProof/>
+                <w:webHidden/>
+              </w:rPr>
+            </w:r>
+            <w:r>
+              <w:rPr>
+                <w:noProof/>
+                <w:webHidden/>
+              </w:rPr>
+              <w:fldChar w:fldCharType="separate"/>
+            </w:r>
+            <w:r>
+              <w:rPr>
+                <w:noProof/>
+                <w:webHidden/>
+              </w:rPr>
+              <w:t>10</w:t>
+            </w:r>
+            <w:r>
+              <w:rPr>
+                <w:noProof/>
+                <w:webHidden/>
+              </w:rPr>
+              <w:fldChar w:fldCharType="end"/>
+            </w:r>
+          </w:hyperlink>
+        </w:p>
+        <w:p>
+          <w:pPr>
+            <w:pStyle w:val="TDC2"/>
+            <w:tabs>
+              <w:tab w:val="right" w:leader="dot" w:pos="8828"/>
+            </w:tabs>
+            <w:rPr>
+              <w:rFonts w:asciiTheme="minorHAnsi" w:eastAsiaTheme="minorEastAsia" w:hAnsiTheme="minorHAnsi" w:cstheme="minorBidi"/>
+              <w:noProof/>
+              <w:kern w:val="2"/>
+              <w14:ligatures w14:val="standardContextual"/>
+            </w:rPr>
+          </w:pPr>
+          <w:hyperlink w:anchor="_Toc225185326" w:history="1">
+            <w:r>
+              <w:rPr>
+                <w:rStyle w:val="Hipervnculo"/>
+                <w:noProof/>
+              </w:rPr>
+              <w:t>3. Creación de tablas y asignación a tablespaces</w:t>
+            </w:r>
+            <w:r>
+              <w:rPr>
+                <w:noProof/>
+                <w:webHidden/>
+              </w:rPr>
+              <w:tab/>
+            </w:r>
+            <w:r>
+              <w:rPr>
+                <w:noProof/>
+                <w:webHidden/>
+              </w:rPr>
+              <w:fldChar w:fldCharType="begin"/>
+            </w:r>
+            <w:r>
+              <w:rPr>
+                <w:noProof/>
+                <w:webHidden/>
+              </w:rPr>
+              <w:instrText xml:space="preserve"> PAGEREF _Toc225185326 \h </w:instrText>
+            </w:r>
+            <w:r>
+              <w:rPr>
+                <w:noProof/>
+                <w:webHidden/>
+              </w:rPr>
+            </w:r>
+            <w:r>
+              <w:rPr>
+                <w:noProof/>
+                <w:webHidden/>
+              </w:rPr>
+              <w:fldChar w:fldCharType="separate"/>
+            </w:r>
+            <w:r>
+              <w:rPr>
+                <w:noProof/>
+                <w:webHidden/>
+              </w:rPr>
+              <w:t>12</w:t>
+            </w:r>
+            <w:r>
+              <w:rPr>
+                <w:noProof/>
+                <w:webHidden/>
+              </w:rPr>
+              <w:fldChar w:fldCharType="end"/>
+            </w:r>
+          </w:hyperlink>
+        </w:p>
+        <w:p>
+          <w:pPr>
+            <w:pStyle w:val="TDC2"/>
+            <w:tabs>
+              <w:tab w:val="right" w:leader="dot" w:pos="8828"/>
+            </w:tabs>
+            <w:rPr>
+              <w:rFonts w:asciiTheme="minorHAnsi" w:eastAsiaTheme="minorEastAsia" w:hAnsiTheme="minorHAnsi" w:cstheme="minorBidi"/>
+              <w:noProof/>
+              <w:kern w:val="2"/>
+              <w14:ligatures w14:val="standardContextual"/>
+            </w:rPr>
+          </w:pPr>
+          <w:hyperlink w:anchor="_Toc225185327" w:history="1">
+            <w:r>
+              <w:rPr>
+                <w:rStyle w:val="Hipervnculo"/>
+                <w:noProof/>
+              </w:rPr>
+              <w:t>4. Migración y Archivado en el Tablespace Histórico:</w:t>
+            </w:r>
+            <w:r>
+              <w:rPr>
+                <w:noProof/>
+                <w:webHidden/>
+              </w:rPr>
+              <w:tab/>
+            </w:r>
+            <w:r>
+              <w:rPr>
+                <w:noProof/>
+                <w:webHidden/>
+              </w:rPr>
+              <w:fldChar w:fldCharType="begin"/>
+            </w:r>
+            <w:r>
+              <w:rPr>
+                <w:noProof/>
+                <w:webHidden/>
+              </w:rPr>
+              <w:instrText xml:space="preserve"> PAGEREF _Toc225185327 \h </w:instrText>
+            </w:r>
+            <w:r>
+              <w:rPr>
+                <w:noProof/>
+                <w:webHidden/>
+              </w:rPr>
+            </w:r>
+            <w:r>
+              <w:rPr>
+                <w:noProof/>
+                <w:webHidden/>
+              </w:rPr>
+              <w:fldChar w:fldCharType="separate"/>
+            </w:r>
+            <w:r>
+              <w:rPr>
+                <w:noProof/>
+                <w:webHidden/>
+              </w:rPr>
+              <w:t>17</w:t>
+            </w:r>
+            <w:r>
+              <w:rPr>
+                <w:noProof/>
+                <w:webHidden/>
+              </w:rPr>
+              <w:fldChar w:fldCharType="end"/>
+            </w:r>
+          </w:hyperlink>
+        </w:p>
+        <w:p>
+          <w:pPr>
+            <w:pStyle w:val="TDC1"/>
+            <w:tabs>
+              <w:tab w:val="right" w:leader="dot" w:pos="8828"/>
+            </w:tabs>
+            <w:rPr>
+              <w:rFonts w:asciiTheme="minorHAnsi" w:eastAsiaTheme="minorEastAsia" w:hAnsiTheme="minorHAnsi" w:cstheme="minorBidi"/>
+              <w:noProof/>
+              <w:kern w:val="2"/>
+              <w14:ligatures w14:val="standardContextual"/>
+            </w:rPr>
+          </w:pPr>
+          <w:hyperlink w:anchor="_Toc225185328" w:history="1">
+            <w:r>
+              <w:rPr>
+                <w:rStyle w:val="Hipervnculo"/>
+                <w:noProof/>
+              </w:rPr>
+              <w:t>Práctica 3 — Control del Espacio por Usuario y Schema en MySQL</w:t>
+            </w:r>
+            <w:r>
+              <w:rPr>
+                <w:noProof/>
+                <w:webHidden/>
+              </w:rPr>
+              <w:tab/>
+            </w:r>
+            <w:r>
+              <w:rPr>
+                <w:noProof/>
+                <w:webHidden/>
+              </w:rPr>
+              <w:fldChar w:fldCharType="begin"/>
+            </w:r>
+            <w:r>
+              <w:rPr>
+                <w:noProof/>
+                <w:webHidden/>
+              </w:rPr>
+              <w:instrText xml:space="preserve"> PAGEREF _Toc225185328 \h </w:instrText>
+            </w:r>
+            <w:r>
+              <w:rPr>
+                <w:noProof/>
+                <w:webHidden/>
+              </w:rPr>
+            </w:r>
+            <w:r>
+              <w:rPr>
+                <w:noProof/>
+                <w:webHidden/>
+              </w:rPr>
+              <w:fldChar w:fldCharType="separate"/>
+            </w:r>
+            <w:r>
+              <w:rPr>
+                <w:noProof/>
+                <w:webHidden/>
+              </w:rPr>
+              <w:t>19</w:t>
+            </w:r>
+            <w:r>
+              <w:rPr>
+                <w:noProof/>
+                <w:webHidden/>
+              </w:rPr>
+              <w:fldChar w:fldCharType="end"/>
+            </w:r>
+          </w:hyperlink>
+        </w:p>
+        <w:p>
+          <w:pPr>
+            <w:pStyle w:val="TDC2"/>
+            <w:tabs>
+              <w:tab w:val="right" w:leader="dot" w:pos="8828"/>
+            </w:tabs>
+            <w:rPr>
+              <w:rFonts w:asciiTheme="minorHAnsi" w:eastAsiaTheme="minorEastAsia" w:hAnsiTheme="minorHAnsi" w:cstheme="minorBidi"/>
+              <w:noProof/>
+              <w:kern w:val="2"/>
+              <w14:ligatures w14:val="standardContextual"/>
+            </w:rPr>
+          </w:pPr>
+          <w:hyperlink w:anchor="_Toc225185329" w:history="1">
+            <w:r>
+              <w:rPr>
+                <w:rStyle w:val="Hipervnculo"/>
+                <w:noProof/>
+              </w:rPr>
+              <w:t>3.1    Crear usuarios con límites de recursos</w:t>
+            </w:r>
+            <w:r>
+              <w:rPr>
+                <w:noProof/>
+                <w:webHidden/>
+              </w:rPr>
+              <w:tab/>
+            </w:r>
+            <w:r>
+              <w:rPr>
+                <w:noProof/>
+                <w:webHidden/>
+              </w:rPr>
+              <w:fldChar w:fldCharType="begin"/>
+            </w:r>
+            <w:r>
+              <w:rPr>
+                <w:noProof/>
+                <w:webHidden/>
+              </w:rPr>
+              <w:instrText xml:space="preserve"> PAGEREF _Toc225185329 \h </w:instrText>
+            </w:r>
+            <w:r>
+              <w:rPr>
+                <w:noProof/>
+                <w:webHidden/>
+              </w:rPr>
+            </w:r>
+            <w:r>
+              <w:rPr>
+                <w:noProof/>
+                <w:webHidden/>
+              </w:rPr>
+              <w:fldChar w:fldCharType="separate"/>
+            </w:r>
+            <w:r>
+              <w:rPr>
+                <w:noProof/>
+                <w:webHidden/>
+              </w:rPr>
+              <w:t>19</w:t>
+            </w:r>
+            <w:r>
+              <w:rPr>
+                <w:noProof/>
+                <w:webHidden/>
+              </w:rPr>
+              <w:fldChar w:fldCharType="end"/>
+            </w:r>
+          </w:hyperlink>
+        </w:p>
+        <w:p>
+          <w:pPr>
+            <w:pStyle w:val="TDC3"/>
+            <w:tabs>
+              <w:tab w:val="right" w:leader="dot" w:pos="8828"/>
+            </w:tabs>
+            <w:rPr>
+              <w:rFonts w:asciiTheme="minorHAnsi" w:eastAsiaTheme="minorEastAsia" w:hAnsiTheme="minorHAnsi" w:cstheme="minorBidi"/>
+              <w:noProof/>
+              <w:kern w:val="2"/>
+              <w14:ligatures w14:val="standardContextual"/>
+            </w:rPr>
+          </w:pPr>
+          <w:hyperlink w:anchor="_Toc225185330" w:history="1">
+            <w:r>
+              <w:rPr>
+                <w:rStyle w:val="Hipervnculo"/>
+                <w:noProof/>
+              </w:rPr>
+              <w:t>1.Crear usuarios con límites de recursos</w:t>
+            </w:r>
+            <w:r>
+              <w:rPr>
+                <w:noProof/>
+                <w:webHidden/>
+              </w:rPr>
+              <w:tab/>
+            </w:r>
+            <w:r>
+              <w:rPr>
+                <w:noProof/>
+                <w:webHidden/>
+              </w:rPr>
+              <w:fldChar w:fldCharType="begin"/>
+            </w:r>
+            <w:r>
+              <w:rPr>
+                <w:noProof/>
+                <w:webHidden/>
+              </w:rPr>
+              <w:instrText xml:space="preserve"> PAGEREF _Toc225185330 \h </w:instrText>
+            </w:r>
+            <w:r>
+              <w:rPr>
+                <w:noProof/>
+                <w:webHidden/>
+              </w:rPr>
+            </w:r>
+            <w:r>
+              <w:rPr>
+                <w:noProof/>
+                <w:webHidden/>
+              </w:rPr>
+              <w:fldChar w:fldCharType="separate"/>
+            </w:r>
+            <w:r>
+              <w:rPr>
+                <w:noProof/>
+                <w:webHidden/>
+              </w:rPr>
+              <w:t>19</w:t>
+            </w:r>
+            <w:r>
+              <w:rPr>
+                <w:noProof/>
+                <w:webHidden/>
+              </w:rPr>
+              <w:fldChar w:fldCharType="end"/>
+            </w:r>
+          </w:hyperlink>
+        </w:p>
+        <w:p>
+          <w:pPr>
+            <w:pStyle w:val="TDC3"/>
+            <w:tabs>
+              <w:tab w:val="right" w:leader="dot" w:pos="8828"/>
+            </w:tabs>
+            <w:rPr>
+              <w:rFonts w:asciiTheme="minorHAnsi" w:eastAsiaTheme="minorEastAsia" w:hAnsiTheme="minorHAnsi" w:cstheme="minorBidi"/>
+              <w:noProof/>
+              <w:kern w:val="2"/>
+              <w14:ligatures w14:val="standardContextual"/>
+            </w:rPr>
+          </w:pPr>
+          <w:hyperlink w:anchor="_Toc225185331" w:history="1">
+            <w:r>
+              <w:rPr>
+                <w:rStyle w:val="Hipervnculo"/>
+                <w:noProof/>
+              </w:rPr>
+              <w:t>2.    Verificar los usuarios y sus restricciones</w:t>
+            </w:r>
+            <w:r>
+              <w:rPr>
+                <w:noProof/>
+                <w:webHidden/>
+              </w:rPr>
+              <w:tab/>
+            </w:r>
+            <w:r>
+              <w:rPr>
+                <w:noProof/>
+                <w:webHidden/>
+              </w:rPr>
+              <w:fldChar w:fldCharType="begin"/>
+            </w:r>
+            <w:r>
+              <w:rPr>
+                <w:noProof/>
+                <w:webHidden/>
+              </w:rPr>
+              <w:instrText xml:space="preserve"> PAGEREF _Toc225185331 \h </w:instrText>
+            </w:r>
+            <w:r>
+              <w:rPr>
+                <w:noProof/>
+                <w:webHidden/>
+              </w:rPr>
+            </w:r>
+            <w:r>
+              <w:rPr>
+                <w:noProof/>
+                <w:webHidden/>
+              </w:rPr>
+              <w:fldChar w:fldCharType="separate"/>
+            </w:r>
+            <w:r>
+              <w:rPr>
+                <w:noProof/>
+                <w:webHidden/>
+              </w:rPr>
+              <w:t>21</w:t>
+            </w:r>
+            <w:r>
+              <w:rPr>
+                <w:noProof/>
+                <w:webHidden/>
+              </w:rPr>
+              <w:fldChar w:fldCharType="end"/>
+            </w:r>
+          </w:hyperlink>
+        </w:p>
+        <w:p>
+          <w:pPr>
+            <w:pStyle w:val="TDC2"/>
+            <w:tabs>
+              <w:tab w:val="right" w:leader="dot" w:pos="8828"/>
+            </w:tabs>
+            <w:rPr>
+              <w:rFonts w:asciiTheme="minorHAnsi" w:eastAsiaTheme="minorEastAsia" w:hAnsiTheme="minorHAnsi" w:cstheme="minorBidi"/>
+              <w:noProof/>
+              <w:kern w:val="2"/>
+              <w14:ligatures w14:val="standardContextual"/>
+            </w:rPr>
+          </w:pPr>
+          <w:hyperlink w:anchor="_Toc225185332" w:history="1">
+            <w:r>
+              <w:rPr>
+                <w:rStyle w:val="Hipervnculo"/>
+                <w:noProof/>
+              </w:rPr>
+              <w:t>Práctica 3.2 — Monitoreo de espacio por schema</w:t>
+            </w:r>
+            <w:r>
+              <w:rPr>
+                <w:noProof/>
+                <w:webHidden/>
+              </w:rPr>
+              <w:tab/>
+            </w:r>
+            <w:r>
+              <w:rPr>
+                <w:noProof/>
+                <w:webHidden/>
+              </w:rPr>
+              <w:fldChar w:fldCharType="begin"/>
+            </w:r>
+            <w:r>
+              <w:rPr>
+                <w:noProof/>
+                <w:webHidden/>
+              </w:rPr>
+              <w:instrText xml:space="preserve"> PAGEREF _Toc225185332 \h </w:instrText>
+            </w:r>
+            <w:r>
+              <w:rPr>
+                <w:noProof/>
+                <w:webHidden/>
+              </w:rPr>
+            </w:r>
+            <w:r>
+              <w:rPr>
+                <w:noProof/>
+                <w:webHidden/>
+              </w:rPr>
+              <w:fldChar w:fldCharType="separate"/>
+            </w:r>
+            <w:r>
+              <w:rPr>
+                <w:noProof/>
+                <w:webHidden/>
+              </w:rPr>
+              <w:t>22</w:t>
+            </w:r>
+            <w:r>
+              <w:rPr>
+                <w:noProof/>
+                <w:webHidden/>
+              </w:rPr>
+              <w:fldChar w:fldCharType="end"/>
+            </w:r>
+          </w:hyperlink>
+        </w:p>
+        <w:p>
+          <w:pPr>
+            <w:pStyle w:val="TDC2"/>
+            <w:tabs>
+              <w:tab w:val="right" w:leader="dot" w:pos="8828"/>
+            </w:tabs>
+            <w:rPr>
+              <w:rFonts w:asciiTheme="minorHAnsi" w:eastAsiaTheme="minorEastAsia" w:hAnsiTheme="minorHAnsi" w:cstheme="minorBidi"/>
+              <w:noProof/>
+              <w:kern w:val="2"/>
+              <w14:ligatures w14:val="standardContextual"/>
+            </w:rPr>
+          </w:pPr>
+          <w:hyperlink w:anchor="_Toc225185333" w:history="1">
+            <w:r>
+              <w:rPr>
+                <w:rStyle w:val="Hipervnculo"/>
+                <w:bCs/>
+                <w:noProof/>
+              </w:rPr>
+              <w:t>Espacio total por schema con alertas</w:t>
+            </w:r>
+            <w:r>
+              <w:rPr>
+                <w:noProof/>
+                <w:webHidden/>
+              </w:rPr>
+              <w:tab/>
+            </w:r>
+            <w:r>
+              <w:rPr>
+                <w:noProof/>
+                <w:webHidden/>
+              </w:rPr>
+              <w:fldChar w:fldCharType="begin"/>
+            </w:r>
+            <w:r>
+              <w:rPr>
+                <w:noProof/>
+                <w:webHidden/>
+              </w:rPr>
+              <w:instrText xml:space="preserve"> PAGEREF _Toc225185333 \h </w:instrText>
+            </w:r>
+            <w:r>
+              <w:rPr>
+                <w:noProof/>
+                <w:webHidden/>
+              </w:rPr>
+            </w:r>
+            <w:r>
+              <w:rPr>
+                <w:noProof/>
+                <w:webHidden/>
+              </w:rPr>
+              <w:fldChar w:fldCharType="separate"/>
+            </w:r>
+            <w:r>
+              <w:rPr>
+                <w:noProof/>
+                <w:webHidden/>
+              </w:rPr>
+              <w:t>22</w:t>
+            </w:r>
+            <w:r>
+              <w:rPr>
+                <w:noProof/>
+                <w:webHidden/>
+              </w:rPr>
+              <w:fldChar w:fldCharType="end"/>
+            </w:r>
+          </w:hyperlink>
+        </w:p>
+        <w:p>
+          <w:pPr>
+            <w:pStyle w:val="TDC1"/>
+            <w:tabs>
+              <w:tab w:val="right" w:leader="dot" w:pos="8828"/>
+            </w:tabs>
+            <w:rPr>
+              <w:rFonts w:asciiTheme="minorHAnsi" w:eastAsiaTheme="minorEastAsia" w:hAnsiTheme="minorHAnsi" w:cstheme="minorBidi"/>
+              <w:noProof/>
+              <w:kern w:val="2"/>
+              <w14:ligatures w14:val="standardContextual"/>
+            </w:rPr>
+          </w:pPr>
+          <w:hyperlink w:anchor="_Toc225185334" w:history="1">
+            <w:r>
+              <w:rPr>
+                <w:rStyle w:val="Hipervnculo"/>
+                <w:noProof/>
+              </w:rPr>
+              <w:t>Práctica 4 — Gestión del Espacio de Objetos de la Base de Datos</w:t>
+            </w:r>
+            <w:r>
+              <w:rPr>
+                <w:noProof/>
+                <w:webHidden/>
+              </w:rPr>
+              <w:tab/>
+            </w:r>
+            <w:r>
+              <w:rPr>
+                <w:noProof/>
+                <w:webHidden/>
+              </w:rPr>
+              <w:fldChar w:fldCharType="begin"/>
+            </w:r>
+            <w:r>
+              <w:rPr>
+                <w:noProof/>
+                <w:webHidden/>
+              </w:rPr>
+              <w:instrText xml:space="preserve"> PAGEREF _Toc225185334 \h </w:instrText>
+            </w:r>
+            <w:r>
+              <w:rPr>
+                <w:noProof/>
+                <w:webHidden/>
+              </w:rPr>
+            </w:r>
+            <w:r>
+              <w:rPr>
+                <w:noProof/>
+                <w:webHidden/>
+              </w:rPr>
+              <w:fldChar w:fldCharType="separate"/>
+            </w:r>
+            <w:r>
+              <w:rPr>
+                <w:noProof/>
+                <w:webHidden/>
+              </w:rPr>
+              <w:t>26</w:t>
+            </w:r>
+            <w:r>
+              <w:rPr>
+                <w:noProof/>
+                <w:webHidden/>
+              </w:rPr>
+              <w:fldChar w:fldCharType="end"/>
+            </w:r>
+          </w:hyperlink>
+        </w:p>
+        <w:p>
+          <w:pPr>
+            <w:pStyle w:val="TDC2"/>
+            <w:tabs>
+              <w:tab w:val="right" w:leader="dot" w:pos="8828"/>
+            </w:tabs>
+            <w:rPr>
+              <w:rFonts w:asciiTheme="minorHAnsi" w:eastAsiaTheme="minorEastAsia" w:hAnsiTheme="minorHAnsi" w:cstheme="minorBidi"/>
+              <w:noProof/>
+              <w:kern w:val="2"/>
+              <w14:ligatures w14:val="standardContextual"/>
+            </w:rPr>
+          </w:pPr>
+          <w:hyperlink w:anchor="_Toc225185335" w:history="1">
+            <w:r>
+              <w:rPr>
+                <w:rStyle w:val="Hipervnculo"/>
+                <w:noProof/>
+              </w:rPr>
+              <w:t>Ejercicio 4.1 Crear tabla particionada para gestión eficiente del espacio</w:t>
+            </w:r>
+            <w:r>
+              <w:rPr>
+                <w:noProof/>
+                <w:webHidden/>
+              </w:rPr>
+              <w:tab/>
+            </w:r>
+            <w:r>
+              <w:rPr>
+                <w:noProof/>
+                <w:webHidden/>
+              </w:rPr>
+              <w:fldChar w:fldCharType="begin"/>
+            </w:r>
+            <w:r>
+              <w:rPr>
+                <w:noProof/>
+                <w:webHidden/>
+              </w:rPr>
+              <w:instrText xml:space="preserve"> PAGEREF _Toc225185335 \h </w:instrText>
+            </w:r>
+            <w:r>
+              <w:rPr>
+                <w:noProof/>
+                <w:webHidden/>
+              </w:rPr>
+            </w:r>
+            <w:r>
+              <w:rPr>
+                <w:noProof/>
+                <w:webHidden/>
+              </w:rPr>
+              <w:fldChar w:fldCharType="separate"/>
+            </w:r>
+            <w:r>
+              <w:rPr>
+                <w:noProof/>
+                <w:webHidden/>
+              </w:rPr>
+              <w:t>26</w:t>
+            </w:r>
+            <w:r>
+              <w:rPr>
+                <w:noProof/>
+                <w:webHidden/>
+              </w:rPr>
+              <w:fldChar w:fldCharType="end"/>
+            </w:r>
+          </w:hyperlink>
+        </w:p>
+        <w:p>
+          <w:pPr>
+            <w:pStyle w:val="TDC3"/>
+            <w:tabs>
+              <w:tab w:val="right" w:leader="dot" w:pos="8828"/>
+            </w:tabs>
+            <w:rPr>
+              <w:rFonts w:asciiTheme="minorHAnsi" w:eastAsiaTheme="minorEastAsia" w:hAnsiTheme="minorHAnsi" w:cstheme="minorBidi"/>
+              <w:noProof/>
+              <w:kern w:val="2"/>
+              <w14:ligatures w14:val="standardContextual"/>
+            </w:rPr>
+          </w:pPr>
+          <w:hyperlink w:anchor="_Toc225185336" w:history="1">
+            <w:r>
+              <w:rPr>
+                <w:rStyle w:val="Hipervnculo"/>
+                <w:noProof/>
+              </w:rPr>
+              <w:t>1 Crear tabla particionada para gestión eficiente del espacio</w:t>
+            </w:r>
+            <w:r>
+              <w:rPr>
+                <w:noProof/>
+                <w:webHidden/>
+              </w:rPr>
+              <w:tab/>
+            </w:r>
+            <w:r>
+              <w:rPr>
+                <w:noProof/>
+                <w:webHidden/>
+              </w:rPr>
+              <w:fldChar w:fldCharType="begin"/>
+            </w:r>
+            <w:r>
+              <w:rPr>
+                <w:noProof/>
+                <w:webHidden/>
+              </w:rPr>
+              <w:instrText xml:space="preserve"> PAGEREF _Toc225185336 \h </w:instrText>
+            </w:r>
+            <w:r>
+              <w:rPr>
+                <w:noProof/>
+                <w:webHidden/>
+              </w:rPr>
+            </w:r>
+            <w:r>
+              <w:rPr>
+                <w:noProof/>
+                <w:webHidden/>
+              </w:rPr>
+              <w:fldChar w:fldCharType="separate"/>
+            </w:r>
+            <w:r>
+              <w:rPr>
+                <w:noProof/>
+                <w:webHidden/>
+              </w:rPr>
+              <w:t>26</w:t>
+            </w:r>
+            <w:r>
+              <w:rPr>
+                <w:noProof/>
+                <w:webHidden/>
+              </w:rPr>
+              <w:fldChar w:fldCharType="end"/>
+            </w:r>
+          </w:hyperlink>
+        </w:p>
+        <w:p>
+          <w:pPr>
+            <w:pStyle w:val="TDC3"/>
+            <w:tabs>
+              <w:tab w:val="right" w:leader="dot" w:pos="8828"/>
+            </w:tabs>
+            <w:rPr>
+              <w:rFonts w:asciiTheme="minorHAnsi" w:eastAsiaTheme="minorEastAsia" w:hAnsiTheme="minorHAnsi" w:cstheme="minorBidi"/>
+              <w:noProof/>
+              <w:kern w:val="2"/>
+              <w14:ligatures w14:val="standardContextual"/>
+            </w:rPr>
+          </w:pPr>
+          <w:hyperlink w:anchor="_Toc225185337" w:history="1">
+            <w:r>
+              <w:rPr>
+                <w:rStyle w:val="Hipervnculo"/>
+                <w:noProof/>
+              </w:rPr>
+              <w:t>2  Verificar las particiones creadas</w:t>
+            </w:r>
+            <w:r>
+              <w:rPr>
+                <w:noProof/>
+                <w:webHidden/>
+              </w:rPr>
+              <w:tab/>
+            </w:r>
+            <w:r>
+              <w:rPr>
+                <w:noProof/>
+                <w:webHidden/>
+              </w:rPr>
+              <w:fldChar w:fldCharType="begin"/>
+            </w:r>
+            <w:r>
+              <w:rPr>
+                <w:noProof/>
+                <w:webHidden/>
+              </w:rPr>
+              <w:instrText xml:space="preserve"> PAGEREF _Toc225185337 \h </w:instrText>
+            </w:r>
+            <w:r>
+              <w:rPr>
+                <w:noProof/>
+                <w:webHidden/>
+              </w:rPr>
+            </w:r>
+            <w:r>
+              <w:rPr>
+                <w:noProof/>
+                <w:webHidden/>
+              </w:rPr>
+              <w:fldChar w:fldCharType="separate"/>
+            </w:r>
+            <w:r>
+              <w:rPr>
+                <w:noProof/>
+                <w:webHidden/>
+              </w:rPr>
+              <w:t>27</w:t>
+            </w:r>
+            <w:r>
+              <w:rPr>
+                <w:noProof/>
+                <w:webHidden/>
+              </w:rPr>
+              <w:fldChar w:fldCharType="end"/>
+            </w:r>
+          </w:hyperlink>
+        </w:p>
+        <w:p>
+          <w:pPr>
+            <w:pStyle w:val="TDC3"/>
+            <w:tabs>
+              <w:tab w:val="right" w:leader="dot" w:pos="8828"/>
+            </w:tabs>
+            <w:rPr>
+              <w:rFonts w:asciiTheme="minorHAnsi" w:eastAsiaTheme="minorEastAsia" w:hAnsiTheme="minorHAnsi" w:cstheme="minorBidi"/>
+              <w:noProof/>
+              <w:kern w:val="2"/>
+              <w14:ligatures w14:val="standardContextual"/>
+            </w:rPr>
+          </w:pPr>
+          <w:hyperlink w:anchor="_Toc225185338" w:history="1">
+            <w:r>
+              <w:rPr>
+                <w:rStyle w:val="Hipervnculo"/>
+                <w:noProof/>
+              </w:rPr>
+              <w:t>3 Insertar datos y verificar partition pruning</w:t>
+            </w:r>
+            <w:r>
+              <w:rPr>
+                <w:noProof/>
+                <w:webHidden/>
+              </w:rPr>
+              <w:tab/>
+            </w:r>
+            <w:r>
+              <w:rPr>
+                <w:noProof/>
+                <w:webHidden/>
+              </w:rPr>
+              <w:fldChar w:fldCharType="begin"/>
+            </w:r>
+            <w:r>
+              <w:rPr>
+                <w:noProof/>
+                <w:webHidden/>
+              </w:rPr>
+              <w:instrText xml:space="preserve"> PAGEREF _Toc225185338 \h </w:instrText>
+            </w:r>
+            <w:r>
+              <w:rPr>
+                <w:noProof/>
+                <w:webHidden/>
+              </w:rPr>
+            </w:r>
+            <w:r>
+              <w:rPr>
+                <w:noProof/>
+                <w:webHidden/>
+              </w:rPr>
+              <w:fldChar w:fldCharType="separate"/>
+            </w:r>
+            <w:r>
+              <w:rPr>
+                <w:noProof/>
+                <w:webHidden/>
+              </w:rPr>
+              <w:t>27</w:t>
+            </w:r>
+            <w:r>
+              <w:rPr>
+                <w:noProof/>
+                <w:webHidden/>
+              </w:rPr>
+              <w:fldChar w:fldCharType="end"/>
+            </w:r>
+          </w:hyperlink>
+        </w:p>
+        <w:p>
+          <w:pPr>
+            <w:pStyle w:val="TDC2"/>
+            <w:tabs>
+              <w:tab w:val="right" w:leader="dot" w:pos="8828"/>
+            </w:tabs>
+            <w:rPr>
+              <w:rFonts w:asciiTheme="minorHAnsi" w:eastAsiaTheme="minorEastAsia" w:hAnsiTheme="minorHAnsi" w:cstheme="minorBidi"/>
+              <w:noProof/>
+              <w:kern w:val="2"/>
+              <w14:ligatures w14:val="standardContextual"/>
+            </w:rPr>
+          </w:pPr>
+          <w:hyperlink w:anchor="_Toc225185339" w:history="1">
+            <w:r>
+              <w:rPr>
+                <w:rStyle w:val="Hipervnculo"/>
+                <w:noProof/>
+              </w:rPr>
+              <w:t>Ejercicio 4.2 Gestión de índices y espacio en MySQL</w:t>
+            </w:r>
+            <w:r>
+              <w:rPr>
+                <w:noProof/>
+                <w:webHidden/>
+              </w:rPr>
+              <w:tab/>
+            </w:r>
+            <w:r>
+              <w:rPr>
+                <w:noProof/>
+                <w:webHidden/>
+              </w:rPr>
+              <w:fldChar w:fldCharType="begin"/>
+            </w:r>
+            <w:r>
+              <w:rPr>
+                <w:noProof/>
+                <w:webHidden/>
+              </w:rPr>
+              <w:instrText xml:space="preserve"> PAGEREF _Toc225185339 \h </w:instrText>
+            </w:r>
+            <w:r>
+              <w:rPr>
+                <w:noProof/>
+                <w:webHidden/>
+              </w:rPr>
+            </w:r>
+            <w:r>
+              <w:rPr>
+                <w:noProof/>
+                <w:webHidden/>
+              </w:rPr>
+              <w:fldChar w:fldCharType="separate"/>
+            </w:r>
+            <w:r>
+              <w:rPr>
+                <w:noProof/>
+                <w:webHidden/>
+              </w:rPr>
+              <w:t>28</w:t>
+            </w:r>
+            <w:r>
+              <w:rPr>
+                <w:noProof/>
+                <w:webHidden/>
+              </w:rPr>
+              <w:fldChar w:fldCharType="end"/>
+            </w:r>
+          </w:hyperlink>
+        </w:p>
+        <w:p>
+          <w:pPr>
+            <w:pStyle w:val="TDC3"/>
+            <w:tabs>
+              <w:tab w:val="right" w:leader="dot" w:pos="8828"/>
+            </w:tabs>
+            <w:rPr>
+              <w:rFonts w:asciiTheme="minorHAnsi" w:eastAsiaTheme="minorEastAsia" w:hAnsiTheme="minorHAnsi" w:cstheme="minorBidi"/>
+              <w:noProof/>
+              <w:kern w:val="2"/>
+              <w14:ligatures w14:val="standardContextual"/>
+            </w:rPr>
+          </w:pPr>
+          <w:hyperlink w:anchor="_Toc225185340" w:history="1">
+            <w:r>
+              <w:rPr>
+                <w:rStyle w:val="Hipervnculo"/>
+                <w:noProof/>
+              </w:rPr>
+              <w:t>1 Analizar fragmentación de índices con optimizer_trace</w:t>
+            </w:r>
+            <w:r>
+              <w:rPr>
+                <w:noProof/>
+                <w:webHidden/>
+              </w:rPr>
+              <w:tab/>
+            </w:r>
+            <w:r>
+              <w:rPr>
+                <w:noProof/>
+                <w:webHidden/>
+              </w:rPr>
+              <w:fldChar w:fldCharType="begin"/>
+            </w:r>
+            <w:r>
+              <w:rPr>
+                <w:noProof/>
+                <w:webHidden/>
+              </w:rPr>
+              <w:instrText xml:space="preserve"> PAGEREF _Toc225185340 \h </w:instrText>
+            </w:r>
+            <w:r>
+              <w:rPr>
+                <w:noProof/>
+                <w:webHidden/>
+              </w:rPr>
+            </w:r>
+            <w:r>
+              <w:rPr>
+                <w:noProof/>
+                <w:webHidden/>
+              </w:rPr>
+              <w:fldChar w:fldCharType="separate"/>
+            </w:r>
+            <w:r>
+              <w:rPr>
+                <w:noProof/>
+                <w:webHidden/>
+              </w:rPr>
+              <w:t>28</w:t>
+            </w:r>
+            <w:r>
+              <w:rPr>
+                <w:noProof/>
+                <w:webHidden/>
+              </w:rPr>
+              <w:fldChar w:fldCharType="end"/>
+            </w:r>
+          </w:hyperlink>
+        </w:p>
+        <w:p>
+          <w:pPr>
+            <w:pStyle w:val="TDC3"/>
+            <w:tabs>
+              <w:tab w:val="right" w:leader="dot" w:pos="8828"/>
+            </w:tabs>
+            <w:rPr>
+              <w:rFonts w:asciiTheme="minorHAnsi" w:eastAsiaTheme="minorEastAsia" w:hAnsiTheme="minorHAnsi" w:cstheme="minorBidi"/>
+              <w:noProof/>
+              <w:kern w:val="2"/>
+              <w14:ligatures w14:val="standardContextual"/>
+            </w:rPr>
+          </w:pPr>
+          <w:hyperlink w:anchor="_Toc225185341" w:history="1">
+            <w:r>
+              <w:rPr>
+                <w:rStyle w:val="Hipervnculo"/>
+                <w:noProof/>
+              </w:rPr>
+              <w:t>2 Detectar índices sin uso con performance_schema</w:t>
+            </w:r>
+            <w:r>
+              <w:rPr>
+                <w:noProof/>
+                <w:webHidden/>
+              </w:rPr>
+              <w:tab/>
+            </w:r>
+            <w:r>
+              <w:rPr>
+                <w:noProof/>
+                <w:webHidden/>
+              </w:rPr>
+              <w:fldChar w:fldCharType="begin"/>
+            </w:r>
+            <w:r>
+              <w:rPr>
+                <w:noProof/>
+                <w:webHidden/>
+              </w:rPr>
+              <w:instrText xml:space="preserve"> PAGEREF _Toc225185341 \h </w:instrText>
+            </w:r>
+            <w:r>
+              <w:rPr>
+                <w:noProof/>
+                <w:webHidden/>
+              </w:rPr>
+            </w:r>
+            <w:r>
+              <w:rPr>
+                <w:noProof/>
+                <w:webHidden/>
+              </w:rPr>
+              <w:fldChar w:fldCharType="separate"/>
+            </w:r>
+            <w:r>
+              <w:rPr>
+                <w:noProof/>
+                <w:webHidden/>
+              </w:rPr>
+              <w:t>29</w:t>
+            </w:r>
+            <w:r>
+              <w:rPr>
+                <w:noProof/>
+                <w:webHidden/>
+              </w:rPr>
+              <w:fldChar w:fldCharType="end"/>
+            </w:r>
+          </w:hyperlink>
+        </w:p>
+        <w:p>
+          <w:pPr>
+            <w:pStyle w:val="TDC1"/>
+            <w:tabs>
+              <w:tab w:val="right" w:leader="dot" w:pos="8828"/>
+            </w:tabs>
+            <w:rPr>
+              <w:rFonts w:asciiTheme="minorHAnsi" w:eastAsiaTheme="minorEastAsia" w:hAnsiTheme="minorHAnsi" w:cstheme="minorBidi"/>
+              <w:noProof/>
+              <w:kern w:val="2"/>
+              <w14:ligatures w14:val="standardContextual"/>
+            </w:rPr>
+          </w:pPr>
+          <w:hyperlink w:anchor="_Toc225185342" w:history="1">
+            <w:r>
+              <w:rPr>
+                <w:rStyle w:val="Hipervnculo"/>
+                <w:noProof/>
+              </w:rPr>
+              <w:t>Práctica 5 — Roles y Privilegios de Almacenamiento en MySQL</w:t>
+            </w:r>
+            <w:r>
+              <w:rPr>
+                <w:noProof/>
+                <w:webHidden/>
+              </w:rPr>
+              <w:tab/>
+            </w:r>
+            <w:r>
+              <w:rPr>
+                <w:noProof/>
+                <w:webHidden/>
+              </w:rPr>
+              <w:fldChar w:fldCharType="begin"/>
+            </w:r>
+            <w:r>
+              <w:rPr>
+                <w:noProof/>
+                <w:webHidden/>
+              </w:rPr>
+              <w:instrText xml:space="preserve"> PAGEREF _Toc225185342 \h </w:instrText>
+            </w:r>
+            <w:r>
+              <w:rPr>
+                <w:noProof/>
+                <w:webHidden/>
+              </w:rPr>
+            </w:r>
+            <w:r>
+              <w:rPr>
+                <w:noProof/>
+                <w:webHidden/>
+              </w:rPr>
+              <w:fldChar w:fldCharType="separate"/>
+            </w:r>
+            <w:r>
+              <w:rPr>
+                <w:noProof/>
+                <w:webHidden/>
+              </w:rPr>
+              <w:t>30</w:t>
+            </w:r>
+            <w:r>
+              <w:rPr>
+                <w:noProof/>
+                <w:webHidden/>
+              </w:rPr>
+              <w:fldChar w:fldCharType="end"/>
+            </w:r>
+          </w:hyperlink>
+        </w:p>
+        <w:p>
+          <w:pPr>
+            <w:pStyle w:val="TDC2"/>
+            <w:tabs>
+              <w:tab w:val="right" w:leader="dot" w:pos="8828"/>
+            </w:tabs>
+            <w:rPr>
+              <w:rFonts w:asciiTheme="minorHAnsi" w:eastAsiaTheme="minorEastAsia" w:hAnsiTheme="minorHAnsi" w:cstheme="minorBidi"/>
+              <w:noProof/>
+              <w:kern w:val="2"/>
+              <w14:ligatures w14:val="standardContextual"/>
+            </w:rPr>
+          </w:pPr>
+          <w:hyperlink w:anchor="_Toc225185343" w:history="1">
+            <w:r>
+              <w:rPr>
+                <w:rStyle w:val="Hipervnculo"/>
+                <w:noProof/>
+              </w:rPr>
+              <w:t>1    Crear los roles de almacenamiento</w:t>
+            </w:r>
+            <w:r>
+              <w:rPr>
+                <w:noProof/>
+                <w:webHidden/>
+              </w:rPr>
+              <w:tab/>
+            </w:r>
+            <w:r>
+              <w:rPr>
+                <w:noProof/>
+                <w:webHidden/>
+              </w:rPr>
+              <w:fldChar w:fldCharType="begin"/>
+            </w:r>
+            <w:r>
+              <w:rPr>
+                <w:noProof/>
+                <w:webHidden/>
+              </w:rPr>
+              <w:instrText xml:space="preserve"> PAGEREF _Toc225185343 \h </w:instrText>
+            </w:r>
+            <w:r>
+              <w:rPr>
+                <w:noProof/>
+                <w:webHidden/>
+              </w:rPr>
+            </w:r>
+            <w:r>
+              <w:rPr>
+                <w:noProof/>
+                <w:webHidden/>
+              </w:rPr>
+              <w:fldChar w:fldCharType="separate"/>
+            </w:r>
+            <w:r>
+              <w:rPr>
+                <w:noProof/>
+                <w:webHidden/>
+              </w:rPr>
+              <w:t>30</w:t>
+            </w:r>
+            <w:r>
+              <w:rPr>
+                <w:noProof/>
+                <w:webHidden/>
+              </w:rPr>
+              <w:fldChar w:fldCharType="end"/>
+            </w:r>
+          </w:hyperlink>
+        </w:p>
+        <w:p>
+          <w:pPr>
+            <w:pStyle w:val="TDC2"/>
+            <w:tabs>
+              <w:tab w:val="right" w:leader="dot" w:pos="8828"/>
+            </w:tabs>
+            <w:rPr>
+              <w:rFonts w:asciiTheme="minorHAnsi" w:eastAsiaTheme="minorEastAsia" w:hAnsiTheme="minorHAnsi" w:cstheme="minorBidi"/>
+              <w:noProof/>
+              <w:kern w:val="2"/>
+              <w14:ligatures w14:val="standardContextual"/>
+            </w:rPr>
+          </w:pPr>
+          <w:hyperlink w:anchor="_Toc225185344" w:history="1">
+            <w:r>
+              <w:rPr>
+                <w:rStyle w:val="Hipervnculo"/>
+                <w:noProof/>
+              </w:rPr>
+              <w:t>2    Asignar roles a los usuarios</w:t>
+            </w:r>
+            <w:r>
+              <w:rPr>
+                <w:noProof/>
+                <w:webHidden/>
+              </w:rPr>
+              <w:tab/>
+            </w:r>
+            <w:r>
+              <w:rPr>
+                <w:noProof/>
+                <w:webHidden/>
+              </w:rPr>
+              <w:fldChar w:fldCharType="begin"/>
+            </w:r>
+            <w:r>
+              <w:rPr>
+                <w:noProof/>
+                <w:webHidden/>
+              </w:rPr>
+              <w:instrText xml:space="preserve"> PAGEREF _Toc225185344 \h </w:instrText>
+            </w:r>
+            <w:r>
+              <w:rPr>
+                <w:noProof/>
+                <w:webHidden/>
+              </w:rPr>
+            </w:r>
+            <w:r>
+              <w:rPr>
+                <w:noProof/>
+                <w:webHidden/>
+              </w:rPr>
+              <w:fldChar w:fldCharType="separate"/>
+            </w:r>
+            <w:r>
+              <w:rPr>
+                <w:noProof/>
+                <w:webHidden/>
+              </w:rPr>
+              <w:t>34</w:t>
+            </w:r>
+            <w:r>
+              <w:rPr>
+                <w:noProof/>
+                <w:webHidden/>
+              </w:rPr>
+              <w:fldChar w:fldCharType="end"/>
+            </w:r>
+          </w:hyperlink>
+        </w:p>
+        <w:p>
+          <w:pPr>
+            <w:pStyle w:val="TDC2"/>
+            <w:tabs>
+              <w:tab w:val="right" w:leader="dot" w:pos="8828"/>
+            </w:tabs>
+            <w:rPr>
+              <w:rFonts w:asciiTheme="minorHAnsi" w:eastAsiaTheme="minorEastAsia" w:hAnsiTheme="minorHAnsi" w:cstheme="minorBidi"/>
+              <w:noProof/>
+              <w:kern w:val="2"/>
+              <w14:ligatures w14:val="standardContextual"/>
+            </w:rPr>
+          </w:pPr>
+          <w:hyperlink w:anchor="_Toc225185345" w:history="1">
+            <w:r>
+              <w:rPr>
+                <w:rStyle w:val="Hipervnculo"/>
+                <w:noProof/>
+              </w:rPr>
+              <w:t>3    Verificar roles y privilegios asignados</w:t>
+            </w:r>
+            <w:r>
+              <w:rPr>
+                <w:noProof/>
+                <w:webHidden/>
+              </w:rPr>
+              <w:tab/>
+            </w:r>
+            <w:r>
+              <w:rPr>
+                <w:noProof/>
+                <w:webHidden/>
+              </w:rPr>
+              <w:fldChar w:fldCharType="begin"/>
+            </w:r>
+            <w:r>
+              <w:rPr>
+                <w:noProof/>
+                <w:webHidden/>
+              </w:rPr>
+              <w:instrText xml:space="preserve"> PAGEREF _Toc225185345 \h </w:instrText>
+            </w:r>
+            <w:r>
+              <w:rPr>
+                <w:noProof/>
+                <w:webHidden/>
+              </w:rPr>
+            </w:r>
+            <w:r>
+              <w:rPr>
+                <w:noProof/>
+                <w:webHidden/>
+              </w:rPr>
+              <w:fldChar w:fldCharType="separate"/>
+            </w:r>
+            <w:r>
+              <w:rPr>
+                <w:noProof/>
+                <w:webHidden/>
+              </w:rPr>
+              <w:t>35</w:t>
             </w:r>
             <w:r>
               <w:rPr>
@@ -1362,6 +2926,10 @@
         <w:tabs>
           <w:tab w:val="right" w:leader="dot" w:pos="9350"/>
         </w:tabs>
+        <w:rPr>
+          <w:sz w:val="24"/>
+          <w:szCs w:val="24"/>
+        </w:rPr>
       </w:pPr>
       <w:r>
         <w:rPr>
@@ -1369,63 +2937,6 @@
           <w:szCs w:val="24"/>
         </w:rPr>
         <w:t xml:space="preserve"> </w:t>
-      </w:r>
-    </w:p>
-    <w:p>
-      <w:r>
-        <w:rPr>
-          <w:rFonts w:ascii="Arial" w:hAnsi="Arial" w:cs="Arial"/>
-          <w:sz w:val="24"/>
-          <w:szCs w:val="24"/>
-        </w:rPr>
-        <w:br w:type="page"/>
-      </w:r>
-    </w:p>
-    <w:p>
-      <w:pPr>
-        <w:jc w:val="right"/>
-        <w:rPr>
-          <w:rFonts w:ascii="Arial" w:hAnsi="Arial" w:cs="Arial"/>
-          <w:sz w:val="24"/>
-          <w:szCs w:val="24"/>
-        </w:rPr>
-      </w:pPr>
-    </w:p>
-    <w:p>
-      <w:pPr>
-        <w:pStyle w:val="Ttulo1"/>
-        <w:ind w:firstLine="0"/>
-      </w:pPr>
-      <w:bookmarkStart w:id="1" w:name="_Toc224899878"/>
-      <w:r>
-        <w:t>In</w:t>
-      </w:r>
-      <w:r>
-        <w:t>troducción</w:t>
-      </w:r>
-      <w:bookmarkEnd w:id="1"/>
-    </w:p>
-    <w:p>
-      <w:pPr>
-        <w:spacing w:before="80" w:after="80" w:line="276" w:lineRule="auto"/>
-        <w:jc w:val="both"/>
-      </w:pPr>
-      <w:r>
-        <w:t>En el ámbito de la administración de bases de datos, la gestión eficiente del espacio en disco representa uno de los desafíos más críticos y constantes para cualquier equipo de tecnología. A medida que los sistemas de información crecen en volumen y complejidad, la capacidad de organizar, monitorear y optimizar el almacenamiento físico y lógico se convierte en una habilidad indispensable para garantizar la continuidad operativa d las aplicaciones. Una mala planificación en este aspecto no solo puede derivar en un deterioro progresivo del rendimiento, sino también en interrupciones del servicio, pérdida de integridad de los datos y un incremento desproporcionado en los costos de infraestructura. Por esta razón, los administradores de bases de datos deben dominar las herramientas y mecanismos que los motores de bases de datos ponen a su disposición para anticiparse a estos problemas antes de que se conviertan en incidentes críticos.</w:t>
-      </w:r>
-    </w:p>
-    <w:p>
-      <w:pPr>
-        <w:spacing w:before="100" w:after="100"/>
-      </w:pPr>
-    </w:p>
-    <w:p>
-      <w:pPr>
-        <w:spacing w:before="80" w:after="80" w:line="276" w:lineRule="auto"/>
-        <w:jc w:val="both"/>
-      </w:pPr>
-      <w:r>
-        <w:t>El presente reporte de prácticas documenta de manera detallada una serie de actividades realizadas sobre el motor MySQL con el objetivo de adquirir competencias prácticas en la configuración y administración del espacio en disco.</w:t>
       </w:r>
     </w:p>
     <w:p>
@@ -1435,19 +2946,36 @@
         <w:spacing w:line="259" w:lineRule="auto"/>
         <w:textAlignment w:val="auto"/>
         <w:rPr>
-          <w:rFonts w:ascii="Arial" w:hAnsi="Arial" w:cs="Arial"/>
-          <w:sz w:val="24"/>
-          <w:szCs w:val="24"/>
-        </w:rPr>
-      </w:pPr>
-      <w:r>
-        <w:rPr>
-          <w:rFonts w:ascii="Arial" w:hAnsi="Arial" w:cs="Arial"/>
-          <w:sz w:val="24"/>
-          <w:szCs w:val="24"/>
+          <w:lang w:val="es-MX" w:eastAsia="es-MX"/>
+        </w:rPr>
+      </w:pPr>
+      <w:r>
+        <w:rPr>
+          <w:lang w:val="es-MX" w:eastAsia="es-MX"/>
         </w:rPr>
         <w:br w:type="page"/>
       </w:r>
+    </w:p>
+    <w:p>
+      <w:pPr>
+        <w:rPr>
+          <w:lang w:val="es-MX" w:eastAsia="es-MX"/>
+        </w:rPr>
+      </w:pPr>
+    </w:p>
+    <w:p>
+      <w:pPr>
+        <w:pStyle w:val="Ttulo1"/>
+        <w:ind w:firstLine="0"/>
+      </w:pPr>
+      <w:bookmarkStart w:id="1" w:name="_Toc225185311"/>
+      <w:r>
+        <w:t>In</w:t>
+      </w:r>
+      <w:r>
+        <w:t>troducción</w:t>
+      </w:r>
+      <w:bookmarkEnd w:id="1"/>
     </w:p>
     <w:p>
       <w:pPr>
@@ -1456,6 +2984,187 @@
         <w:spacing w:line="259" w:lineRule="auto"/>
         <w:textAlignment w:val="auto"/>
         <w:rPr>
+          <w:lang w:val="es-MX"/>
+        </w:rPr>
+      </w:pPr>
+      <w:r>
+        <w:rPr>
+          <w:lang w:val="es-MX"/>
+        </w:rPr>
+        <w:t xml:space="preserve">La administración del espacio en disco dentro de los sistemas gestores de bases de datos es un aspecto fundamental para garantizar el rendimiento, la disponibilidad y la eficiencia en el manejo de la información. En el caso de MySQL 8.0, específicamente con el motor de almacenamiento </w:t>
+      </w:r>
+      <w:proofErr w:type="spellStart"/>
+      <w:r>
+        <w:rPr>
+          <w:lang w:val="es-MX"/>
+        </w:rPr>
+        <w:t>InnoDB</w:t>
+      </w:r>
+      <w:proofErr w:type="spellEnd"/>
+      <w:r>
+        <w:rPr>
+          <w:lang w:val="es-MX"/>
+        </w:rPr>
+        <w:t xml:space="preserve">, esta gestión adquiere una relevancia aún mayor debido a la forma en que organiza los datos en archivos físicos, </w:t>
+      </w:r>
+      <w:proofErr w:type="spellStart"/>
+      <w:r>
+        <w:rPr>
+          <w:lang w:val="es-MX"/>
+        </w:rPr>
+        <w:t>tablespaces</w:t>
+      </w:r>
+      <w:proofErr w:type="spellEnd"/>
+      <w:r>
+        <w:rPr>
+          <w:lang w:val="es-MX"/>
+        </w:rPr>
+        <w:t xml:space="preserve"> y estructuras internas como índices, buffers y logs de transacciones. A lo largo de esta práctica, se aborda de manera integral cómo se configura, monitorea y optimiza el uso del almacenamiento, partiendo desde la comprensión de variables clave del sistema hasta la implementación de estrategias avanzadas para el control del espacio.</w:t>
+      </w:r>
+    </w:p>
+    <w:p>
+      <w:pPr>
+        <w:suppressAutoHyphens w:val="0"/>
+        <w:autoSpaceDN/>
+        <w:spacing w:line="259" w:lineRule="auto"/>
+        <w:textAlignment w:val="auto"/>
+        <w:rPr>
+          <w:lang w:val="es-MX"/>
+        </w:rPr>
+      </w:pPr>
+      <w:r>
+        <w:rPr>
+          <w:lang w:val="es-MX"/>
+        </w:rPr>
+        <w:t xml:space="preserve">Uno de los principales objetivos es comprender cómo MySQL maneja el almacenamiento físico de las bases de datos, identificando elementos como el directorio de datos, los </w:t>
+      </w:r>
+      <w:proofErr w:type="gramStart"/>
+      <w:r>
+        <w:rPr>
+          <w:lang w:val="es-MX"/>
+        </w:rPr>
+        <w:t>archivos .</w:t>
+      </w:r>
+      <w:proofErr w:type="spellStart"/>
+      <w:r>
+        <w:rPr>
+          <w:lang w:val="es-MX"/>
+        </w:rPr>
+        <w:t>ibd</w:t>
+      </w:r>
+      <w:proofErr w:type="spellEnd"/>
+      <w:proofErr w:type="gramEnd"/>
+      <w:r>
+        <w:rPr>
+          <w:lang w:val="es-MX"/>
+        </w:rPr>
+        <w:t xml:space="preserve">, y el uso de </w:t>
+      </w:r>
+      <w:proofErr w:type="spellStart"/>
+      <w:r>
+        <w:rPr>
+          <w:lang w:val="es-MX"/>
+        </w:rPr>
+        <w:t>tablespaces</w:t>
+      </w:r>
+      <w:proofErr w:type="spellEnd"/>
+      <w:r>
+        <w:rPr>
+          <w:lang w:val="es-MX"/>
+        </w:rPr>
+        <w:t xml:space="preserve"> tanto generales como individuales por tabla. Asimismo, se analizan las configuraciones más relevantes, como el tamaño del buffer pool o el uso de </w:t>
+      </w:r>
+      <w:proofErr w:type="spellStart"/>
+      <w:r>
+        <w:rPr>
+          <w:lang w:val="es-MX"/>
+        </w:rPr>
+        <w:t>innodb_file_per_table</w:t>
+      </w:r>
+      <w:proofErr w:type="spellEnd"/>
+      <w:r>
+        <w:rPr>
+          <w:lang w:val="es-MX"/>
+        </w:rPr>
+        <w:t>, que impactan directamente en el rendimiento del sistema. Estos conocimientos permiten al administrador tomar decisiones informadas para optimizar el uso de recursos en distintos entornos, desde desarrollo hasta producción.</w:t>
+      </w:r>
+    </w:p>
+    <w:p>
+      <w:pPr>
+        <w:suppressAutoHyphens w:val="0"/>
+        <w:autoSpaceDN/>
+        <w:spacing w:line="259" w:lineRule="auto"/>
+        <w:textAlignment w:val="auto"/>
+        <w:rPr>
+          <w:lang w:val="es-MX"/>
+        </w:rPr>
+      </w:pPr>
+      <w:r>
+        <w:rPr>
+          <w:lang w:val="es-MX"/>
+        </w:rPr>
+        <w:t xml:space="preserve">Además, la práctica profundiza en técnicas para organizar eficientemente los datos mediante la creación de </w:t>
+      </w:r>
+      <w:proofErr w:type="spellStart"/>
+      <w:r>
+        <w:rPr>
+          <w:lang w:val="es-MX"/>
+        </w:rPr>
+        <w:t>tablespaces</w:t>
+      </w:r>
+      <w:proofErr w:type="spellEnd"/>
+      <w:r>
+        <w:rPr>
+          <w:lang w:val="es-MX"/>
+        </w:rPr>
+        <w:t xml:space="preserve"> específicos, separación de información activa e histórica, y uso de compresión. También se introducen mecanismos de control, como la asignación de roles, restricciones de usuarios y monitoreo del consumo de espacio por esquema, lo cual es esencial en entornos multiusuario. De igual forma, se exploran estrategias de mantenimiento como la eliminación de fragmentación, optimización de tablas e identificación de índices innecesarios.</w:t>
+      </w:r>
+    </w:p>
+    <w:p>
+      <w:pPr>
+        <w:suppressAutoHyphens w:val="0"/>
+        <w:autoSpaceDN/>
+        <w:spacing w:line="259" w:lineRule="auto"/>
+        <w:textAlignment w:val="auto"/>
+        <w:rPr>
+          <w:lang w:val="es-MX"/>
+        </w:rPr>
+      </w:pPr>
+      <w:r>
+        <w:rPr>
+          <w:lang w:val="es-MX"/>
+        </w:rPr>
+        <w:t>En conjunto, esta práctica no solo proporciona habilidades técnicas para la gestión del almacenamiento en MySQL, sino que también fomenta una visión estratégica sobre cómo administrar grandes volúmenes de datos de manera eficiente, segura y escalable, lo cual es indispensable en el contexto actual donde la información es un recurso crítico para las organizaciones.</w:t>
+      </w:r>
+    </w:p>
+    <w:p>
+      <w:pPr>
+        <w:suppressAutoHyphens w:val="0"/>
+        <w:autoSpaceDN/>
+        <w:spacing w:line="259" w:lineRule="auto"/>
+        <w:textAlignment w:val="auto"/>
+        <w:rPr>
+          <w:rFonts w:ascii="Arial" w:hAnsi="Arial" w:cs="Arial"/>
+          <w:sz w:val="24"/>
+          <w:szCs w:val="24"/>
+        </w:rPr>
+      </w:pPr>
+      <w:r>
+        <w:rPr>
+          <w:rFonts w:ascii="Arial" w:hAnsi="Arial" w:cs="Arial"/>
+          <w:sz w:val="24"/>
+          <w:szCs w:val="24"/>
+        </w:rPr>
+        <w:br w:type="page"/>
+      </w:r>
+    </w:p>
+    <w:p>
+      <w:pPr>
+        <w:suppressAutoHyphens w:val="0"/>
+        <w:autoSpaceDN/>
+        <w:spacing w:line="259" w:lineRule="auto"/>
+        <w:textAlignment w:val="auto"/>
+        <w:rPr>
           <w:rFonts w:ascii="Arial" w:hAnsi="Arial" w:cs="Arial"/>
           <w:sz w:val="24"/>
           <w:szCs w:val="24"/>
@@ -1467,7 +3176,7 @@
         <w:pStyle w:val="Ttulo1"/>
         <w:ind w:firstLine="0"/>
       </w:pPr>
-      <w:bookmarkStart w:id="2" w:name="_Toc224899879"/>
+      <w:bookmarkStart w:id="2" w:name="_Toc225185312"/>
       <w:r>
         <w:t>Práctica 1 — Definición y Verificación del Espacio de Almacenamiento</w:t>
       </w:r>
@@ -1477,7 +3186,7 @@
       <w:pPr>
         <w:pStyle w:val="Ttulo2"/>
       </w:pPr>
-      <w:bookmarkStart w:id="3" w:name="_Toc224899880"/>
+      <w:bookmarkStart w:id="3" w:name="_Toc225185313"/>
       <w:r>
         <w:t xml:space="preserve">1. Variables de configuración de </w:t>
       </w:r>
@@ -1513,7 +3222,7 @@
       <w:pPr>
         <w:pStyle w:val="Ttulo3"/>
       </w:pPr>
-      <w:bookmarkStart w:id="4" w:name="_Toc224899881"/>
+      <w:bookmarkStart w:id="4" w:name="_Toc225185314"/>
       <w:r>
         <w:t>1.1 Directorio de datos</w:t>
       </w:r>
@@ -1673,7 +3382,7 @@
       <w:pPr>
         <w:pStyle w:val="Ttulo3"/>
       </w:pPr>
-      <w:bookmarkStart w:id="5" w:name="_Toc224899882"/>
+      <w:bookmarkStart w:id="5" w:name="_Toc225185315"/>
       <w:r>
         <w:t xml:space="preserve">1.2 </w:t>
       </w:r>
@@ -1886,7 +3595,7 @@
       <w:pPr>
         <w:pStyle w:val="Ttulo3"/>
       </w:pPr>
-      <w:bookmarkStart w:id="6" w:name="_Toc224899883"/>
+      <w:bookmarkStart w:id="6" w:name="_Toc225185316"/>
       <w:r>
         <w:t xml:space="preserve">1.3 </w:t>
       </w:r>
@@ -2083,7 +3792,7 @@
       <w:pPr>
         <w:pStyle w:val="Ttulo3"/>
       </w:pPr>
-      <w:bookmarkStart w:id="7" w:name="_Toc224899884"/>
+      <w:bookmarkStart w:id="7" w:name="_Toc225185317"/>
       <w:r>
         <w:t xml:space="preserve">1.4 Tamaño de página </w:t>
       </w:r>
@@ -2267,7 +3976,7 @@
       <w:pPr>
         <w:pStyle w:val="Ttulo3"/>
       </w:pPr>
-      <w:bookmarkStart w:id="8" w:name="_Toc224899885"/>
+      <w:bookmarkStart w:id="8" w:name="_Toc225185318"/>
       <w:r>
         <w:t>1.5 Tamaño del buffer pool</w:t>
       </w:r>
@@ -2454,7 +4163,7 @@
       <w:pPr>
         <w:pStyle w:val="Ttulo3"/>
       </w:pPr>
-      <w:bookmarkStart w:id="9" w:name="_Toc224899886"/>
+      <w:bookmarkStart w:id="9" w:name="_Toc225185319"/>
       <w:r>
         <w:t xml:space="preserve">1.6 Directorio de </w:t>
       </w:r>
@@ -2662,7 +4371,7 @@
       <w:pPr>
         <w:pStyle w:val="Ttulo3"/>
       </w:pPr>
-      <w:bookmarkStart w:id="10" w:name="_Toc224899887"/>
+      <w:bookmarkStart w:id="10" w:name="_Toc225185320"/>
       <w:r>
         <w:t>1.7 Tamaño del log de transacciones</w:t>
       </w:r>
@@ -2879,7 +4588,7 @@
       <w:pPr>
         <w:pStyle w:val="Ttulo2"/>
       </w:pPr>
-      <w:bookmarkStart w:id="11" w:name="_Toc224899888"/>
+      <w:bookmarkStart w:id="11" w:name="_Toc225185321"/>
       <w:r>
         <w:t>2. Espacio total por base de datos</w:t>
       </w:r>
@@ -3697,7 +5406,7 @@
       <w:pPr>
         <w:pStyle w:val="Ttulo2"/>
       </w:pPr>
-      <w:bookmarkStart w:id="12" w:name="_Toc224899889"/>
+      <w:bookmarkStart w:id="12" w:name="_Toc225185322"/>
       <w:r>
         <w:t xml:space="preserve">3. </w:t>
       </w:r>
@@ -4294,7 +6003,7 @@
         <w:pStyle w:val="Ttulo1"/>
         <w:ind w:firstLine="0"/>
       </w:pPr>
-      <w:bookmarkStart w:id="13" w:name="_Toc224899890"/>
+      <w:bookmarkStart w:id="13" w:name="_Toc225185323"/>
       <w:r>
         <w:t>Práctica 2 — Creación del Espacio Asignado para Cada Base de Datos</w:t>
       </w:r>
@@ -4372,6 +6081,7 @@
           <w:lang w:eastAsia="es-MX"/>
         </w:rPr>
       </w:pPr>
+      <w:bookmarkStart w:id="14" w:name="_Toc225185324"/>
       <w:r>
         <w:rPr>
           <w:rFonts w:eastAsia="Times New Roman"/>
@@ -4402,6 +6112,7 @@
         </w:rPr>
         <w:t xml:space="preserve"> generales:</w:t>
       </w:r>
+      <w:bookmarkEnd w:id="14"/>
     </w:p>
     <w:p>
       <w:pPr>
@@ -5748,12 +7459,14 @@
       <w:pPr>
         <w:pStyle w:val="Ttulo2"/>
       </w:pPr>
+      <w:bookmarkStart w:id="15" w:name="_Toc225185325"/>
       <w:r>
         <w:t xml:space="preserve">2. </w:t>
       </w:r>
       <w:r>
         <w:t>Creación y configuración de la base de datos</w:t>
       </w:r>
+      <w:bookmarkEnd w:id="15"/>
     </w:p>
     <w:p>
       <w:pPr>
@@ -6870,6 +8583,7 @@
       <w:pPr>
         <w:pStyle w:val="Ttulo2"/>
       </w:pPr>
+      <w:bookmarkStart w:id="16" w:name="_Toc225185326"/>
       <w:r>
         <w:t xml:space="preserve">3. </w:t>
       </w:r>
@@ -6880,6 +8594,7 @@
       <w:r>
         <w:t>tablespaces</w:t>
       </w:r>
+      <w:bookmarkEnd w:id="16"/>
       <w:proofErr w:type="spellEnd"/>
     </w:p>
     <w:p>
@@ -8369,6 +10084,7 @@
       <w:pPr>
         <w:pStyle w:val="Ttulo2"/>
       </w:pPr>
+      <w:bookmarkStart w:id="17" w:name="_Toc225185327"/>
       <w:r>
         <w:t xml:space="preserve">4. </w:t>
       </w:r>
@@ -8383,6 +10099,7 @@
       <w:r>
         <w:t xml:space="preserve"> Histórico:</w:t>
       </w:r>
+      <w:bookmarkEnd w:id="17"/>
     </w:p>
     <w:p>
       <w:pPr>
@@ -9393,135 +11110,6 @@
       <w:pPr>
         <w:jc w:val="both"/>
         <w:rPr>
-          <w:rStyle w:val="citation-29"/>
-          <w:rFonts w:ascii="Verdana" w:hAnsi="Verdana" w:cs="Arial"/>
-          <w:b/>
-          <w:sz w:val="24"/>
-          <w:szCs w:val="24"/>
-        </w:rPr>
-      </w:pPr>
-    </w:p>
-    <w:p>
-      <w:pPr>
-        <w:jc w:val="both"/>
-        <w:rPr>
-          <w:rStyle w:val="citation-29"/>
-          <w:rFonts w:ascii="Verdana" w:hAnsi="Verdana" w:cs="Arial"/>
-          <w:b/>
-          <w:sz w:val="24"/>
-          <w:szCs w:val="24"/>
-        </w:rPr>
-      </w:pPr>
-    </w:p>
-    <w:p>
-      <w:pPr>
-        <w:jc w:val="both"/>
-        <w:rPr>
-          <w:rStyle w:val="citation-29"/>
-          <w:rFonts w:ascii="Verdana" w:hAnsi="Verdana" w:cs="Arial"/>
-          <w:b/>
-          <w:sz w:val="24"/>
-          <w:szCs w:val="24"/>
-        </w:rPr>
-      </w:pPr>
-    </w:p>
-    <w:p>
-      <w:pPr>
-        <w:jc w:val="both"/>
-        <w:rPr>
-          <w:rStyle w:val="citation-29"/>
-          <w:rFonts w:ascii="Verdana" w:hAnsi="Verdana" w:cs="Arial"/>
-          <w:b/>
-          <w:sz w:val="24"/>
-          <w:szCs w:val="24"/>
-        </w:rPr>
-      </w:pPr>
-    </w:p>
-    <w:p>
-      <w:pPr>
-        <w:jc w:val="both"/>
-        <w:rPr>
-          <w:rStyle w:val="citation-29"/>
-          <w:rFonts w:ascii="Verdana" w:hAnsi="Verdana" w:cs="Arial"/>
-          <w:b/>
-          <w:sz w:val="24"/>
-          <w:szCs w:val="24"/>
-        </w:rPr>
-      </w:pPr>
-    </w:p>
-    <w:p>
-      <w:pPr>
-        <w:jc w:val="both"/>
-        <w:rPr>
-          <w:rStyle w:val="citation-29"/>
-          <w:rFonts w:ascii="Verdana" w:hAnsi="Verdana" w:cs="Arial"/>
-          <w:b/>
-          <w:sz w:val="24"/>
-          <w:szCs w:val="24"/>
-        </w:rPr>
-      </w:pPr>
-    </w:p>
-    <w:p>
-      <w:pPr>
-        <w:jc w:val="both"/>
-        <w:rPr>
-          <w:rStyle w:val="citation-29"/>
-          <w:rFonts w:ascii="Verdana" w:hAnsi="Verdana" w:cs="Arial"/>
-          <w:b/>
-          <w:sz w:val="24"/>
-          <w:szCs w:val="24"/>
-        </w:rPr>
-      </w:pPr>
-    </w:p>
-    <w:p>
-      <w:pPr>
-        <w:jc w:val="both"/>
-        <w:rPr>
-          <w:rStyle w:val="citation-29"/>
-          <w:rFonts w:ascii="Verdana" w:hAnsi="Verdana" w:cs="Arial"/>
-          <w:b/>
-          <w:sz w:val="24"/>
-          <w:szCs w:val="24"/>
-        </w:rPr>
-      </w:pPr>
-    </w:p>
-    <w:p>
-      <w:pPr>
-        <w:jc w:val="both"/>
-        <w:rPr>
-          <w:rStyle w:val="citation-29"/>
-          <w:rFonts w:ascii="Verdana" w:hAnsi="Verdana" w:cs="Arial"/>
-          <w:b/>
-          <w:sz w:val="24"/>
-          <w:szCs w:val="24"/>
-        </w:rPr>
-      </w:pPr>
-    </w:p>
-    <w:p>
-      <w:pPr>
-        <w:jc w:val="both"/>
-        <w:rPr>
-          <w:rFonts w:ascii="Verdana" w:hAnsi="Verdana"/>
-          <w:sz w:val="24"/>
-          <w:szCs w:val="24"/>
-        </w:rPr>
-      </w:pPr>
-    </w:p>
-    <w:p>
-      <w:pPr>
-        <w:jc w:val="both"/>
-        <w:rPr>
-          <w:rFonts w:ascii="Verdana" w:hAnsi="Verdana"/>
-          <w:sz w:val="24"/>
-          <w:szCs w:val="24"/>
-          <w:lang w:val="es-MX"/>
-        </w:rPr>
-      </w:pPr>
-    </w:p>
-    <w:p>
-      <w:pPr>
-        <w:jc w:val="both"/>
-        <w:rPr>
           <w:rFonts w:ascii="Verdana" w:hAnsi="Verdana"/>
           <w:sz w:val="24"/>
           <w:szCs w:val="24"/>
@@ -9534,6 +11122,7 @@
         <w:pStyle w:val="Ttulo1"/>
         <w:ind w:firstLine="0"/>
       </w:pPr>
+      <w:bookmarkStart w:id="18" w:name="_Toc225185328"/>
       <w:r>
         <w:t xml:space="preserve">Práctica 3 — Control del Espacio por Usuario y </w:t>
       </w:r>
@@ -9545,6 +11134,7 @@
       <w:r>
         <w:t xml:space="preserve"> en MySQL</w:t>
       </w:r>
+      <w:bookmarkEnd w:id="18"/>
     </w:p>
     <w:p>
       <w:pPr>
@@ -9559,19 +11149,15 @@
     <w:p>
       <w:pPr>
         <w:pStyle w:val="Ttulo2"/>
-        <w:rPr>
-          <w:lang w:val="es-MX"/>
-        </w:rPr>
-      </w:pPr>
-      <w:r>
-        <w:t>1</w:t>
-      </w:r>
-      <w:r>
-        <w:t>.</w:t>
-      </w:r>
-      <w:r>
-        <w:t xml:space="preserve">    Crear usuarios con límites de recursos</w:t>
-      </w:r>
+      </w:pPr>
+      <w:bookmarkStart w:id="19" w:name="_Toc225185329"/>
+      <w:r>
+        <w:t>3.</w:t>
+      </w:r>
+      <w:r>
+        <w:t>1    Crear usuarios con límites de recursos</w:t>
+      </w:r>
+      <w:bookmarkEnd w:id="19"/>
     </w:p>
     <w:p>
       <w:pPr>
@@ -9652,6 +11238,22 @@
         </w:rPr>
         <w:t>Puede conectarse desde cualquier host (%). No tiene límite de consultas ni de actualizaciones, pero está limitado a 100 conexiones por hora y no puede tener más de 10 conexiones activas al mismo tiempo.</w:t>
       </w:r>
+    </w:p>
+    <w:p>
+      <w:pPr>
+        <w:pStyle w:val="Ttulo3"/>
+        <w:rPr>
+          <w:lang w:val="es-MX"/>
+        </w:rPr>
+      </w:pPr>
+      <w:bookmarkStart w:id="20" w:name="_Toc225185330"/>
+      <w:r>
+        <w:t>1.</w:t>
+      </w:r>
+      <w:r>
+        <w:t>Crear usuarios con límites de recursos</w:t>
+      </w:r>
+      <w:bookmarkEnd w:id="20"/>
     </w:p>
     <w:tbl>
       <w:tblPr>
@@ -9772,7 +11374,6 @@
                 <w:color w:val="000000" w:themeColor="text1"/>
                 <w:lang w:val="en-US"/>
               </w:rPr>
-              <w:lastRenderedPageBreak/>
               <w:t xml:space="preserve">    MAX_QUERIES_PER_HOUR     0</w:t>
             </w:r>
           </w:p>
@@ -10006,6 +11607,7 @@
                 <w:color w:val="000000" w:themeColor="text1"/>
                 <w:lang w:val="en-US"/>
               </w:rPr>
+              <w:lastRenderedPageBreak/>
               <w:t xml:space="preserve">    WITH</w:t>
             </w:r>
           </w:p>
@@ -10586,6 +12188,7 @@
                 <w:color w:val="000000" w:themeColor="text1"/>
                 <w:lang w:val="en-US"/>
               </w:rPr>
+              <w:lastRenderedPageBreak/>
               <w:t xml:space="preserve">    </w:t>
             </w:r>
             <w:r>
@@ -10745,11 +12348,12 @@
     </w:p>
     <w:p>
       <w:pPr>
-        <w:pStyle w:val="Ttulo2"/>
-        <w:rPr>
-          <w:lang w:val="es-MX"/>
-        </w:rPr>
-      </w:pPr>
+        <w:pStyle w:val="Ttulo3"/>
+        <w:rPr>
+          <w:lang w:val="es-MX"/>
+        </w:rPr>
+      </w:pPr>
+      <w:bookmarkStart w:id="21" w:name="_Toc225185331"/>
       <w:r>
         <w:rPr>
           <w:lang w:val="es-MX"/>
@@ -10766,7 +12370,14 @@
         <w:rPr>
           <w:lang w:val="es-MX"/>
         </w:rPr>
-        <w:t xml:space="preserve">    Verificar los usuarios y sus restricciones </w:t>
+        <w:t xml:space="preserve">    Verificar los usuarios y sus restricciones</w:t>
+      </w:r>
+      <w:bookmarkEnd w:id="21"/>
+      <w:r>
+        <w:rPr>
+          <w:lang w:val="es-MX"/>
+        </w:rPr>
+        <w:t xml:space="preserve"> </w:t>
       </w:r>
     </w:p>
     <w:p>
@@ -10978,7 +12589,6 @@
                 <w:color w:val="000000" w:themeColor="text1"/>
                 <w:lang w:val="en-US"/>
               </w:rPr>
-              <w:lastRenderedPageBreak/>
               <w:t xml:space="preserve">    </w:t>
             </w:r>
             <w:proofErr w:type="spellStart"/>
@@ -11513,84 +13123,65 @@
     </w:p>
     <w:p>
       <w:pPr>
-        <w:jc w:val="both"/>
-        <w:rPr>
-          <w:rFonts w:ascii="Verdana" w:hAnsi="Verdana"/>
-          <w:b/>
+        <w:pStyle w:val="Ttulo2"/>
+        <w:rPr>
+          <w:lang w:val="es-MX"/>
+        </w:rPr>
+      </w:pPr>
+      <w:bookmarkStart w:id="22" w:name="_Toc225185332"/>
+      <w:r>
+        <w:rPr>
+          <w:lang w:val="es-MX"/>
+        </w:rPr>
+        <w:t xml:space="preserve">Práctica 3.2 — Monitoreo de espacio por </w:t>
+      </w:r>
+      <w:proofErr w:type="spellStart"/>
+      <w:r>
+        <w:rPr>
+          <w:lang w:val="es-MX"/>
+        </w:rPr>
+        <w:t>schema</w:t>
+      </w:r>
+      <w:bookmarkEnd w:id="22"/>
+      <w:proofErr w:type="spellEnd"/>
+    </w:p>
+    <w:p>
+      <w:pPr>
+        <w:pStyle w:val="Ttulo2"/>
+        <w:rPr>
           <w:bCs/>
           <w:color w:val="000000" w:themeColor="text1"/>
-          <w:sz w:val="28"/>
-          <w:lang w:val="es-MX"/>
-        </w:rPr>
-      </w:pPr>
-      <w:r>
-        <w:rPr>
-          <w:rFonts w:ascii="Verdana" w:hAnsi="Verdana"/>
-          <w:b/>
+          <w:lang w:val="es-MX"/>
+        </w:rPr>
+      </w:pPr>
+      <w:bookmarkStart w:id="23" w:name="_Toc225185333"/>
+      <w:r>
+        <w:rPr>
           <w:bCs/>
           <w:color w:val="000000" w:themeColor="text1"/>
-          <w:sz w:val="28"/>
-          <w:lang w:val="es-MX"/>
-        </w:rPr>
-        <w:t xml:space="preserve">Práctica 3.2 — Monitoreo de espacio por </w:t>
+          <w:lang w:val="es-MX"/>
+        </w:rPr>
+        <w:t xml:space="preserve">Espacio total por </w:t>
       </w:r>
       <w:proofErr w:type="spellStart"/>
       <w:r>
         <w:rPr>
-          <w:rFonts w:ascii="Verdana" w:hAnsi="Verdana"/>
-          <w:b/>
           <w:bCs/>
           <w:color w:val="000000" w:themeColor="text1"/>
-          <w:sz w:val="28"/>
           <w:lang w:val="es-MX"/>
         </w:rPr>
         <w:t>schema</w:t>
       </w:r>
       <w:proofErr w:type="spellEnd"/>
-    </w:p>
-    <w:p>
-      <w:pPr>
-        <w:jc w:val="both"/>
-        <w:rPr>
-          <w:rFonts w:ascii="Verdana" w:hAnsi="Verdana"/>
-          <w:b/>
+      <w:r>
+        <w:rPr>
           <w:bCs/>
           <w:color w:val="000000" w:themeColor="text1"/>
           <w:lang w:val="es-MX"/>
         </w:rPr>
-      </w:pPr>
-      <w:r>
-        <w:rPr>
-          <w:rFonts w:ascii="Verdana" w:hAnsi="Verdana"/>
-          <w:b/>
-          <w:bCs/>
-          <w:color w:val="000000" w:themeColor="text1"/>
-          <w:lang w:val="es-MX"/>
-        </w:rPr>
-        <w:t xml:space="preserve">Espacio total por </w:t>
-      </w:r>
-      <w:proofErr w:type="spellStart"/>
-      <w:r>
-        <w:rPr>
-          <w:rFonts w:ascii="Verdana" w:hAnsi="Verdana"/>
-          <w:b/>
-          <w:bCs/>
-          <w:color w:val="000000" w:themeColor="text1"/>
-          <w:lang w:val="es-MX"/>
-        </w:rPr>
-        <w:t>schema</w:t>
-      </w:r>
-      <w:proofErr w:type="spellEnd"/>
-      <w:r>
-        <w:rPr>
-          <w:rFonts w:ascii="Verdana" w:hAnsi="Verdana"/>
-          <w:b/>
-          <w:bCs/>
-          <w:color w:val="000000" w:themeColor="text1"/>
-          <w:lang w:val="es-MX"/>
-        </w:rPr>
         <w:t xml:space="preserve"> con alertas</w:t>
       </w:r>
+      <w:bookmarkEnd w:id="23"/>
     </w:p>
     <w:p>
       <w:pPr>
@@ -11743,7 +13334,6 @@
           <w:color w:val="000000" w:themeColor="text1"/>
           <w:lang w:val="es-MX"/>
         </w:rPr>
-        <w:lastRenderedPageBreak/>
         <w:t xml:space="preserve">Incluye una columna de estado que clasifica el </w:t>
       </w:r>
       <w:proofErr w:type="spellStart"/>
@@ -12183,6 +13773,7 @@
                 <w:color w:val="000000" w:themeColor="text1"/>
                 <w:lang w:val="en-US"/>
               </w:rPr>
+              <w:lastRenderedPageBreak/>
               <w:t xml:space="preserve">    ROUND(</w:t>
             </w:r>
             <w:proofErr w:type="gramStart"/>
@@ -12978,6 +14569,7 @@
           <w:color w:val="000000" w:themeColor="text1"/>
           <w:lang w:val="es-MX"/>
         </w:rPr>
+        <w:lastRenderedPageBreak/>
         <w:t xml:space="preserve">Busca las tablas del </w:t>
       </w:r>
       <w:proofErr w:type="spellStart"/>
@@ -13682,7 +15274,6 @@
           <w:color w:val="000000" w:themeColor="text1"/>
           <w:lang w:val="es-MX" w:eastAsia="es-MX"/>
         </w:rPr>
-        <w:lastRenderedPageBreak/>
         <w:drawing>
           <wp:inline distT="0" distB="0" distL="0" distR="0" wp14:anchorId="2F701D51" wp14:editId="7B21691D">
             <wp:extent cx="5943600" cy="1085850"/>
@@ -13745,41 +15336,6 @@
           <w:lang w:val="es-MX"/>
         </w:rPr>
       </w:pPr>
-      <w:r>
-        <w:rPr>
-          <w:rFonts w:ascii="Verdana" w:hAnsi="Verdana"/>
-          <w:b/>
-          <w:bCs/>
-          <w:color w:val="000000" w:themeColor="text1"/>
-          <w:sz w:val="28"/>
-          <w:lang w:val="es-MX"/>
-        </w:rPr>
-        <w:t>3.4</w:t>
-      </w:r>
-      <w:r>
-        <w:rPr>
-          <w:rFonts w:ascii="Verdana" w:hAnsi="Verdana"/>
-          <w:b/>
-          <w:bCs/>
-          <w:color w:val="000000" w:themeColor="text1"/>
-          <w:sz w:val="28"/>
-          <w:lang w:val="es-MX"/>
-        </w:rPr>
-        <w:t xml:space="preserve"> Optimización de tablas fragmentadas</w:t>
-      </w:r>
-    </w:p>
-    <w:p>
-      <w:pPr>
-        <w:jc w:val="both"/>
-        <w:rPr>
-          <w:rFonts w:ascii="Verdana" w:hAnsi="Verdana"/>
-          <w:b/>
-          <w:bCs/>
-          <w:color w:val="000000" w:themeColor="text1"/>
-          <w:sz w:val="28"/>
-          <w:lang w:val="es-MX"/>
-        </w:rPr>
-      </w:pPr>
     </w:p>
     <w:p>
       <w:pPr>
@@ -14258,7 +15814,6 @@
                 <w:color w:val="000000" w:themeColor="text1"/>
                 <w:lang w:val="en-US"/>
               </w:rPr>
-              <w:lastRenderedPageBreak/>
               <w:t xml:space="preserve">SELECT </w:t>
             </w:r>
             <w:proofErr w:type="spellStart"/>
@@ -14604,7 +16159,39 @@
         <w:jc w:val="both"/>
         <w:rPr>
           <w:rFonts w:ascii="Verdana" w:hAnsi="Verdana"/>
-          <w:color w:val="000000" w:themeColor="text1"/>
+        </w:rPr>
+      </w:pPr>
+    </w:p>
+    <w:p>
+      <w:pPr>
+        <w:pStyle w:val="Ttulo1"/>
+        <w:ind w:firstLine="0"/>
+      </w:pPr>
+      <w:bookmarkStart w:id="24" w:name="_Toc225185334"/>
+      <w:r>
+        <w:t>Práctica 4 — Gestión del Espacio de Objetos de la Base de Datos</w:t>
+      </w:r>
+      <w:bookmarkEnd w:id="24"/>
+    </w:p>
+    <w:p>
+      <w:pPr>
+        <w:pStyle w:val="Ttulo2"/>
+      </w:pPr>
+      <w:bookmarkStart w:id="25" w:name="_Toc225185335"/>
+      <w:r>
+        <w:t>Ejercicio 4.1</w:t>
+      </w:r>
+      <w:r>
+        <w:t xml:space="preserve"> </w:t>
+      </w:r>
+      <w:r>
+        <w:t>Crear tabla particionada para gestión eficiente del espacio</w:t>
+      </w:r>
+      <w:bookmarkEnd w:id="25"/>
+    </w:p>
+    <w:p>
+      <w:pPr>
+        <w:rPr>
           <w:lang w:val="es-MX"/>
         </w:rPr>
       </w:pPr>
@@ -14614,354 +16201,49 @@
         <w:jc w:val="both"/>
         <w:rPr>
           <w:rFonts w:ascii="Verdana" w:hAnsi="Verdana"/>
-          <w:color w:val="000000" w:themeColor="text1"/>
-          <w:lang w:val="es-MX"/>
-        </w:rPr>
-      </w:pPr>
+          <w:sz w:val="24"/>
+          <w:szCs w:val="24"/>
+          <w:lang w:val="es-MX"/>
+        </w:rPr>
+      </w:pPr>
+      <w:r>
+        <w:rPr>
+          <w:rFonts w:ascii="Verdana" w:hAnsi="Verdana"/>
+          <w:sz w:val="24"/>
+          <w:szCs w:val="24"/>
+          <w:lang w:val="es-MX"/>
+        </w:rPr>
+        <w:t>En esta práctica se administra el espacio de tablas con diferentes motores y configuraciones, se trabaja con tablas particionadas para gestionar datos históricos, y se monitorean y optimizan índices fragmentados.</w:t>
+      </w:r>
     </w:p>
     <w:p>
       <w:pPr>
         <w:jc w:val="both"/>
         <w:rPr>
           <w:rFonts w:ascii="Verdana" w:hAnsi="Verdana"/>
-          <w:color w:val="000000" w:themeColor="text1"/>
-          <w:lang w:val="es-MX"/>
-        </w:rPr>
-      </w:pPr>
-    </w:p>
-    <w:p>
-      <w:pPr>
-        <w:jc w:val="both"/>
-        <w:rPr>
-          <w:rFonts w:ascii="Verdana" w:hAnsi="Verdana"/>
-          <w:b/>
-          <w:bCs/>
-          <w:color w:val="000000" w:themeColor="text1"/>
-          <w:lang w:val="es-MX"/>
-        </w:rPr>
-      </w:pPr>
-      <w:r>
-        <w:rPr>
-          <w:rFonts w:ascii="Verdana" w:hAnsi="Verdana"/>
-          <w:b/>
-          <w:bCs/>
-          <w:color w:val="000000" w:themeColor="text1"/>
-          <w:lang w:val="es-MX"/>
-        </w:rPr>
-        <w:t>Conclusiones</w:t>
-      </w:r>
-    </w:p>
-    <w:p>
-      <w:pPr>
-        <w:jc w:val="both"/>
-        <w:rPr>
-          <w:rFonts w:ascii="Verdana" w:hAnsi="Verdana"/>
-          <w:color w:val="000000" w:themeColor="text1"/>
-          <w:lang w:val="es-MX"/>
-        </w:rPr>
-      </w:pPr>
-    </w:p>
-    <w:p>
-      <w:pPr>
-        <w:jc w:val="both"/>
-        <w:rPr>
-          <w:rFonts w:ascii="Verdana" w:hAnsi="Verdana"/>
-          <w:color w:val="000000" w:themeColor="text1"/>
-          <w:lang w:val="es-MX"/>
-        </w:rPr>
-      </w:pPr>
-      <w:r>
-        <w:rPr>
-          <w:rFonts w:ascii="Verdana" w:hAnsi="Verdana"/>
-          <w:color w:val="000000" w:themeColor="text1"/>
-          <w:lang w:val="es-MX"/>
-        </w:rPr>
-        <w:t xml:space="preserve">Se crearon los cuatro usuarios sin problema y la consulta de verificación los muestra con los límites correctos y las cuentas activas. El monitoreo de espacio no arrojó alertas, todos los </w:t>
-      </w:r>
-      <w:proofErr w:type="spellStart"/>
-      <w:r>
-        <w:rPr>
-          <w:rFonts w:ascii="Verdana" w:hAnsi="Verdana"/>
-          <w:color w:val="000000" w:themeColor="text1"/>
-          <w:lang w:val="es-MX"/>
-        </w:rPr>
-        <w:t>schemas</w:t>
-      </w:r>
-      <w:proofErr w:type="spellEnd"/>
-      <w:r>
-        <w:rPr>
-          <w:rFonts w:ascii="Verdana" w:hAnsi="Verdana"/>
-          <w:color w:val="000000" w:themeColor="text1"/>
-          <w:lang w:val="es-MX"/>
-        </w:rPr>
-        <w:t xml:space="preserve"> están en NORMAL, aunque ventas tiene una fragmentación bastante llamativa: más espacio desperdiciado que datos reales. Se intentó corregir con OPTIMIZE TABLE, pero la verificación final muestra que los 66 MB fragmentados siguen ahí, probablemente porque la tabla seguía activa durante el proceso.</w:t>
-      </w:r>
-    </w:p>
-    <w:p>
-      <w:pPr>
-        <w:jc w:val="both"/>
-        <w:rPr>
-          <w:rFonts w:ascii="Verdana" w:hAnsi="Verdana"/>
-          <w:color w:val="000000" w:themeColor="text1"/>
-          <w:lang w:val="es-MX"/>
-        </w:rPr>
-      </w:pPr>
-      <w:r>
-        <w:rPr>
-          <w:rFonts w:ascii="Verdana" w:hAnsi="Verdana"/>
-          <w:color w:val="000000" w:themeColor="text1"/>
-          <w:lang w:val="es-MX"/>
-        </w:rPr>
-        <w:t>En general la práctica deja claro por qué vale la pena monitorear estas cosas antes de que se conviertan en un problema, y no después.</w:t>
-      </w:r>
-    </w:p>
-    <w:p>
-      <w:pPr>
-        <w:jc w:val="both"/>
-        <w:rPr>
-          <w:rFonts w:ascii="Verdana" w:hAnsi="Verdana"/>
-          <w:lang w:val="es-MX"/>
-        </w:rPr>
-      </w:pPr>
-    </w:p>
-    <w:p>
-      <w:pPr>
-        <w:jc w:val="both"/>
-        <w:rPr>
-          <w:rFonts w:ascii="Verdana" w:hAnsi="Verdana"/>
-        </w:rPr>
-      </w:pPr>
-    </w:p>
-    <w:p>
-      <w:pPr>
-        <w:jc w:val="both"/>
-        <w:rPr>
-          <w:rFonts w:ascii="Verdana" w:hAnsi="Verdana"/>
-        </w:rPr>
-      </w:pPr>
-    </w:p>
-    <w:p>
-      <w:pPr>
-        <w:jc w:val="both"/>
-        <w:rPr>
-          <w:rFonts w:ascii="Verdana" w:hAnsi="Verdana"/>
-        </w:rPr>
-      </w:pPr>
-    </w:p>
-    <w:p>
-      <w:pPr>
-        <w:jc w:val="both"/>
-        <w:rPr>
-          <w:rFonts w:ascii="Verdana" w:hAnsi="Verdana"/>
-        </w:rPr>
-      </w:pPr>
-    </w:p>
-    <w:p>
-      <w:pPr>
-        <w:jc w:val="both"/>
-        <w:rPr>
-          <w:rFonts w:ascii="Verdana" w:hAnsi="Verdana"/>
-        </w:rPr>
-      </w:pPr>
-    </w:p>
-    <w:p>
-      <w:pPr>
-        <w:jc w:val="both"/>
-        <w:rPr>
-          <w:rFonts w:ascii="Verdana" w:hAnsi="Verdana"/>
-        </w:rPr>
-      </w:pPr>
-    </w:p>
-    <w:p>
-      <w:pPr>
-        <w:jc w:val="both"/>
-        <w:rPr>
-          <w:rFonts w:ascii="Verdana" w:hAnsi="Verdana"/>
-        </w:rPr>
-      </w:pPr>
-    </w:p>
-    <w:p>
-      <w:pPr>
-        <w:jc w:val="both"/>
-        <w:rPr>
-          <w:rFonts w:ascii="Verdana" w:hAnsi="Verdana"/>
-        </w:rPr>
-      </w:pPr>
-    </w:p>
-    <w:p>
-      <w:pPr>
-        <w:jc w:val="both"/>
-        <w:rPr>
-          <w:rFonts w:ascii="Verdana" w:hAnsi="Verdana"/>
-        </w:rPr>
-      </w:pPr>
-    </w:p>
-    <w:p>
-      <w:pPr>
-        <w:jc w:val="both"/>
-        <w:rPr>
-          <w:rFonts w:ascii="Verdana" w:hAnsi="Verdana"/>
-        </w:rPr>
-      </w:pPr>
-    </w:p>
-    <w:p>
-      <w:pPr>
-        <w:jc w:val="both"/>
-        <w:rPr>
-          <w:rFonts w:ascii="Verdana" w:hAnsi="Verdana"/>
-        </w:rPr>
-      </w:pPr>
-    </w:p>
-    <w:p>
-      <w:pPr>
-        <w:jc w:val="both"/>
-        <w:rPr>
-          <w:rFonts w:ascii="Verdana" w:hAnsi="Verdana"/>
-        </w:rPr>
-      </w:pPr>
-    </w:p>
-    <w:p>
-      <w:pPr>
-        <w:jc w:val="both"/>
-        <w:rPr>
-          <w:rFonts w:ascii="Verdana" w:hAnsi="Verdana"/>
-        </w:rPr>
-      </w:pPr>
-    </w:p>
-    <w:p>
-      <w:pPr>
-        <w:jc w:val="both"/>
-        <w:rPr>
-          <w:rFonts w:ascii="Verdana" w:hAnsi="Verdana"/>
-        </w:rPr>
-      </w:pPr>
-    </w:p>
-    <w:p>
-      <w:pPr>
-        <w:jc w:val="both"/>
-        <w:rPr>
-          <w:rFonts w:ascii="Verdana" w:hAnsi="Verdana"/>
-        </w:rPr>
-      </w:pPr>
-    </w:p>
-    <w:p>
-      <w:pPr>
-        <w:jc w:val="both"/>
-        <w:rPr>
-          <w:rFonts w:ascii="Verdana" w:hAnsi="Verdana"/>
-        </w:rPr>
-      </w:pPr>
-    </w:p>
-    <w:p>
-      <w:pPr>
-        <w:jc w:val="both"/>
-        <w:rPr>
-          <w:rFonts w:ascii="Verdana" w:hAnsi="Verdana"/>
-        </w:rPr>
-      </w:pPr>
-    </w:p>
-    <w:p>
-      <w:pPr>
-        <w:jc w:val="both"/>
-        <w:rPr>
-          <w:rFonts w:ascii="Verdana" w:hAnsi="Verdana"/>
-        </w:rPr>
-      </w:pPr>
-    </w:p>
-    <w:p>
-      <w:pPr>
-        <w:jc w:val="both"/>
-        <w:rPr>
-          <w:rFonts w:ascii="Verdana" w:hAnsi="Verdana"/>
-        </w:rPr>
-      </w:pPr>
-    </w:p>
-    <w:p>
-      <w:pPr>
-        <w:jc w:val="both"/>
-        <w:rPr>
-          <w:rFonts w:ascii="Verdana" w:hAnsi="Verdana"/>
-          <w:b/>
-          <w:bCs/>
-          <w:sz w:val="28"/>
-          <w:szCs w:val="24"/>
-          <w:lang w:val="es-MX"/>
-        </w:rPr>
-      </w:pPr>
-      <w:r>
-        <w:rPr>
-          <w:rFonts w:ascii="Verdana" w:hAnsi="Verdana"/>
-          <w:b/>
-          <w:bCs/>
-          <w:sz w:val="28"/>
-          <w:szCs w:val="24"/>
-          <w:lang w:val="es-MX"/>
-        </w:rPr>
-        <w:t>Práctica 4 — Gestión del Espacio de Objetos de la Base de Datos</w:t>
-      </w:r>
-    </w:p>
-    <w:p>
-      <w:pPr>
-        <w:jc w:val="both"/>
-        <w:rPr>
-          <w:rFonts w:ascii="Verdana" w:hAnsi="Verdana"/>
-          <w:sz w:val="24"/>
-          <w:szCs w:val="24"/>
-          <w:lang w:val="es-MX"/>
-        </w:rPr>
-      </w:pPr>
-    </w:p>
-    <w:p>
-      <w:pPr>
-        <w:jc w:val="both"/>
-        <w:rPr>
-          <w:rFonts w:ascii="Verdana" w:hAnsi="Verdana"/>
-          <w:sz w:val="24"/>
-          <w:szCs w:val="24"/>
-          <w:lang w:val="es-MX"/>
-        </w:rPr>
-      </w:pPr>
-      <w:r>
-        <w:rPr>
-          <w:rFonts w:ascii="Verdana" w:hAnsi="Verdana"/>
-          <w:sz w:val="24"/>
-          <w:szCs w:val="24"/>
-          <w:lang w:val="es-MX"/>
-        </w:rPr>
-        <w:t>En esta práctica se administra el espacio de tablas con diferentes motores y configuraciones, se trabaja con tablas particionadas para gestionar datos históricos, y se monitorean y optimizan índices fragmentados.</w:t>
-      </w:r>
-    </w:p>
-    <w:p>
-      <w:pPr>
-        <w:jc w:val="both"/>
-        <w:rPr>
-          <w:rFonts w:ascii="Verdana" w:hAnsi="Verdana"/>
-          <w:sz w:val="24"/>
-          <w:szCs w:val="24"/>
-          <w:lang w:val="es-MX"/>
-        </w:rPr>
-      </w:pPr>
-    </w:p>
-    <w:p>
-      <w:pPr>
-        <w:rPr>
-          <w:b/>
-          <w:bCs/>
-          <w:color w:val="000000" w:themeColor="text1"/>
-          <w:sz w:val="26"/>
-          <w:szCs w:val="26"/>
-        </w:rPr>
-      </w:pPr>
-      <w:r>
-        <w:rPr>
-          <w:b/>
-          <w:bCs/>
-          <w:color w:val="000000" w:themeColor="text1"/>
-          <w:sz w:val="26"/>
-          <w:szCs w:val="26"/>
-        </w:rPr>
-        <w:t>Crear tabla particionada para gestión eficiente del espacio</w:t>
-      </w:r>
+          <w:sz w:val="24"/>
+          <w:szCs w:val="24"/>
+          <w:lang w:val="es-MX"/>
+        </w:rPr>
+      </w:pPr>
+    </w:p>
+    <w:p>
+      <w:pPr>
+        <w:pStyle w:val="Ttulo3"/>
+      </w:pPr>
+      <w:bookmarkStart w:id="26" w:name="_Toc225185336"/>
+      <w:r>
+        <w:t xml:space="preserve">1 </w:t>
+      </w:r>
+      <w:proofErr w:type="gramStart"/>
+      <w:r>
+        <w:t>Crear</w:t>
+      </w:r>
+      <w:proofErr w:type="gramEnd"/>
+      <w:r>
+        <w:t xml:space="preserve"> tabla particionada para gestión eficiente del espacio</w:t>
+      </w:r>
+      <w:bookmarkEnd w:id="26"/>
     </w:p>
     <w:p>
       <w:pPr>
@@ -14982,7 +16264,6 @@
           <w:szCs w:val="26"/>
           <w:lang w:val="es-MX" w:eastAsia="es-MX"/>
         </w:rPr>
-        <w:lastRenderedPageBreak/>
         <w:drawing>
           <wp:inline distT="0" distB="0" distL="0" distR="0" wp14:anchorId="01FE730D" wp14:editId="2F545170">
             <wp:extent cx="3555957" cy="3373290"/>
@@ -15028,19 +16309,20 @@
           <w:color w:val="000000" w:themeColor="text1"/>
           <w:sz w:val="26"/>
           <w:szCs w:val="26"/>
-        </w:rPr>
-      </w:pPr>
-    </w:p>
-    <w:p>
-      <w:pPr>
+          <w:lang w:val="es-MX"/>
+        </w:rPr>
+      </w:pPr>
+      <w:r>
         <w:rPr>
           <w:b/>
           <w:bCs/>
           <w:color w:val="000000" w:themeColor="text1"/>
           <w:sz w:val="26"/>
           <w:szCs w:val="26"/>
-        </w:rPr>
-      </w:pPr>
+          <w:lang w:val="es-MX"/>
+        </w:rPr>
+        <w:t>El particionamiento en MySQL permite dividir una tabla grande en porciones más manejables, mejorando el rendimiento de las consultas y facilitando el archivado y eliminación de datos históricos.</w:t>
+      </w:r>
     </w:p>
     <w:p>
       <w:pPr>
@@ -15077,57 +16359,21 @@
     </w:p>
     <w:p>
       <w:pPr>
-        <w:rPr>
-          <w:b/>
-          <w:bCs/>
-          <w:color w:val="000000" w:themeColor="text1"/>
-          <w:sz w:val="26"/>
-          <w:szCs w:val="26"/>
-        </w:rPr>
-      </w:pPr>
-    </w:p>
-    <w:p>
-      <w:pPr>
-        <w:rPr>
-          <w:b/>
-          <w:bCs/>
-          <w:color w:val="000000" w:themeColor="text1"/>
-          <w:sz w:val="26"/>
-          <w:szCs w:val="26"/>
-        </w:rPr>
-      </w:pPr>
-    </w:p>
-    <w:p>
-      <w:pPr>
-        <w:rPr>
-          <w:b/>
-          <w:bCs/>
-          <w:color w:val="000000" w:themeColor="text1"/>
-          <w:sz w:val="26"/>
-          <w:szCs w:val="26"/>
-        </w:rPr>
-      </w:pPr>
-    </w:p>
-    <w:p>
-      <w:pPr>
-        <w:rPr>
-          <w:b/>
-          <w:bCs/>
-          <w:color w:val="000000" w:themeColor="text1"/>
-          <w:sz w:val="26"/>
-          <w:szCs w:val="26"/>
-        </w:rPr>
-      </w:pPr>
-      <w:r>
-        <w:rPr>
-          <w:b/>
-          <w:bCs/>
-          <w:color w:val="000000" w:themeColor="text1"/>
-          <w:sz w:val="26"/>
-          <w:szCs w:val="26"/>
-        </w:rPr>
-        <w:t xml:space="preserve">Ver particiones </w:t>
-      </w:r>
+        <w:pStyle w:val="Ttulo3"/>
+      </w:pPr>
+      <w:bookmarkStart w:id="27" w:name="_Toc225185337"/>
+      <w:proofErr w:type="gramStart"/>
+      <w:r>
+        <w:t xml:space="preserve">2  </w:t>
+      </w:r>
+      <w:r>
+        <w:t>Verificar</w:t>
+      </w:r>
+      <w:proofErr w:type="gramEnd"/>
+      <w:r>
+        <w:t xml:space="preserve"> las particiones creadas</w:t>
+      </w:r>
+      <w:bookmarkEnd w:id="27"/>
     </w:p>
     <w:p>
       <w:pPr>
@@ -15148,7 +16394,6 @@
           <w:szCs w:val="26"/>
           <w:lang w:val="es-MX" w:eastAsia="es-MX"/>
         </w:rPr>
-        <w:lastRenderedPageBreak/>
         <w:drawing>
           <wp:inline distT="0" distB="0" distL="0" distR="0" wp14:anchorId="6AF2E1D7" wp14:editId="41B86BCA">
             <wp:extent cx="5612130" cy="2194560"/>
@@ -15288,73 +16533,39 @@
     </w:p>
     <w:p>
       <w:pPr>
-        <w:spacing w:line="259" w:lineRule="auto"/>
-        <w:rPr>
-          <w:b/>
-          <w:bCs/>
-          <w:color w:val="000000" w:themeColor="text1"/>
-          <w:sz w:val="26"/>
-          <w:szCs w:val="26"/>
-          <w:lang w:val="es-MX"/>
-        </w:rPr>
-      </w:pPr>
-      <w:r>
-        <w:rPr>
-          <w:b/>
-          <w:bCs/>
-          <w:color w:val="000000" w:themeColor="text1"/>
-          <w:sz w:val="26"/>
-          <w:szCs w:val="26"/>
-        </w:rPr>
-        <w:t xml:space="preserve">Paso 2 </w:t>
-      </w:r>
-      <w:r>
-        <w:rPr>
-          <w:b/>
-          <w:bCs/>
-          <w:color w:val="000000" w:themeColor="text1"/>
-          <w:sz w:val="26"/>
-          <w:szCs w:val="26"/>
-          <w:lang w:val="es-MX"/>
-        </w:rPr>
-        <w:t xml:space="preserve">Insertar datos y verificar </w:t>
+        <w:pStyle w:val="Ttulo3"/>
+        <w:rPr>
+          <w:lang w:val="es-MX"/>
+        </w:rPr>
+      </w:pPr>
+      <w:bookmarkStart w:id="28" w:name="_Toc225185338"/>
+      <w:r>
+        <w:t>3</w:t>
+      </w:r>
+      <w:r>
+        <w:t xml:space="preserve"> </w:t>
+      </w:r>
+      <w:proofErr w:type="gramStart"/>
+      <w:r>
+        <w:t>Insertar</w:t>
+      </w:r>
+      <w:proofErr w:type="gramEnd"/>
+      <w:r>
+        <w:t xml:space="preserve"> datos y verificar </w:t>
       </w:r>
       <w:proofErr w:type="spellStart"/>
       <w:r>
-        <w:rPr>
-          <w:b/>
-          <w:bCs/>
-          <w:color w:val="000000" w:themeColor="text1"/>
-          <w:sz w:val="26"/>
-          <w:szCs w:val="26"/>
-          <w:lang w:val="es-MX"/>
-        </w:rPr>
         <w:t>partition</w:t>
       </w:r>
       <w:proofErr w:type="spellEnd"/>
       <w:r>
-        <w:rPr>
-          <w:b/>
-          <w:bCs/>
-          <w:color w:val="000000" w:themeColor="text1"/>
-          <w:sz w:val="26"/>
-          <w:szCs w:val="26"/>
-          <w:lang w:val="es-MX"/>
-        </w:rPr>
         <w:t xml:space="preserve"> </w:t>
       </w:r>
       <w:proofErr w:type="spellStart"/>
       <w:r>
-        <w:rPr>
-          <w:b/>
-          <w:bCs/>
-          <w:color w:val="000000" w:themeColor="text1"/>
-          <w:sz w:val="26"/>
-          <w:szCs w:val="26"/>
-          <w:lang w:val="es-MX"/>
-        </w:rPr>
         <w:t>pruning</w:t>
       </w:r>
+      <w:bookmarkEnd w:id="28"/>
       <w:proofErr w:type="spellEnd"/>
     </w:p>
     <w:p>
@@ -15512,7 +16723,6 @@
           <w:sz w:val="26"/>
           <w:szCs w:val="26"/>
         </w:rPr>
-        <w:lastRenderedPageBreak/>
         <w:t xml:space="preserve">El EXPLAIN confirma que MySQL usó </w:t>
       </w:r>
       <w:proofErr w:type="spellStart"/>
@@ -15676,88 +16886,42 @@
     </w:p>
     <w:p>
       <w:pPr>
-        <w:spacing w:line="259" w:lineRule="auto"/>
-        <w:rPr>
-          <w:b/>
-          <w:bCs/>
-          <w:color w:val="000000" w:themeColor="text1"/>
-          <w:sz w:val="26"/>
-          <w:szCs w:val="26"/>
-        </w:rPr>
-      </w:pPr>
-      <w:r>
-        <w:rPr>
-          <w:b/>
-          <w:bCs/>
-          <w:color w:val="000000" w:themeColor="text1"/>
-          <w:sz w:val="26"/>
-          <w:szCs w:val="26"/>
-        </w:rPr>
+        <w:pStyle w:val="Ttulo2"/>
+      </w:pPr>
+      <w:bookmarkStart w:id="29" w:name="_Toc225185339"/>
+      <w:r>
         <w:t>Ejercicio 4.2</w:t>
       </w:r>
-    </w:p>
-    <w:p>
-      <w:pPr>
-        <w:rPr>
-          <w:b/>
-          <w:bCs/>
-          <w:color w:val="000000" w:themeColor="text1"/>
-          <w:sz w:val="26"/>
-          <w:szCs w:val="26"/>
-        </w:rPr>
-      </w:pPr>
-      <w:r>
-        <w:rPr>
-          <w:b/>
-          <w:bCs/>
-          <w:color w:val="000000" w:themeColor="text1"/>
-          <w:sz w:val="26"/>
-          <w:szCs w:val="26"/>
-        </w:rPr>
+      <w:r>
+        <w:t xml:space="preserve"> </w:t>
+      </w:r>
+      <w:r>
         <w:t>Gestión de índices y espacio en MySQL</w:t>
       </w:r>
-    </w:p>
-    <w:p>
-      <w:pPr>
-        <w:rPr>
-          <w:b/>
-          <w:bCs/>
-          <w:color w:val="000000" w:themeColor="text1"/>
-          <w:sz w:val="26"/>
-          <w:szCs w:val="26"/>
-        </w:rPr>
-      </w:pPr>
-      <w:r>
-        <w:rPr>
-          <w:b/>
-          <w:bCs/>
-          <w:color w:val="000000" w:themeColor="text1"/>
-          <w:sz w:val="26"/>
-          <w:szCs w:val="26"/>
-        </w:rPr>
-        <w:t xml:space="preserve">Paso 1 </w:t>
-      </w:r>
-      <w:r>
-        <w:rPr>
-          <w:b/>
-          <w:bCs/>
-          <w:color w:val="000000" w:themeColor="text1"/>
-          <w:sz w:val="26"/>
-          <w:szCs w:val="26"/>
-        </w:rPr>
-        <w:t xml:space="preserve">Analizar fragmentación de índices con </w:t>
+      <w:bookmarkEnd w:id="29"/>
+    </w:p>
+    <w:p/>
+    <w:p>
+      <w:pPr>
+        <w:pStyle w:val="Ttulo3"/>
+      </w:pPr>
+      <w:bookmarkStart w:id="30" w:name="_Toc225185340"/>
+      <w:r>
+        <w:t xml:space="preserve">1 </w:t>
+      </w:r>
+      <w:proofErr w:type="gramStart"/>
+      <w:r>
+        <w:t>Analizar</w:t>
+      </w:r>
+      <w:proofErr w:type="gramEnd"/>
+      <w:r>
+        <w:t xml:space="preserve"> fragmentación de índices con </w:t>
       </w:r>
       <w:proofErr w:type="spellStart"/>
       <w:r>
-        <w:rPr>
-          <w:b/>
-          <w:bCs/>
-          <w:color w:val="000000" w:themeColor="text1"/>
-          <w:sz w:val="26"/>
-          <w:szCs w:val="26"/>
-        </w:rPr>
         <w:t>optimizer_trace</w:t>
       </w:r>
+      <w:bookmarkEnd w:id="30"/>
       <w:proofErr w:type="spellEnd"/>
     </w:p>
     <w:p>
@@ -15859,46 +17023,31 @@
     </w:p>
     <w:p>
       <w:pPr>
-        <w:rPr>
-          <w:b/>
-          <w:bCs/>
-          <w:color w:val="000000" w:themeColor="text1"/>
-          <w:sz w:val="26"/>
-          <w:szCs w:val="26"/>
-          <w:lang w:val="es-MX"/>
-        </w:rPr>
-      </w:pPr>
-      <w:r>
-        <w:rPr>
-          <w:b/>
-          <w:bCs/>
-          <w:color w:val="000000" w:themeColor="text1"/>
-          <w:sz w:val="26"/>
-          <w:szCs w:val="26"/>
-        </w:rPr>
-        <w:t xml:space="preserve">Paso 2 </w:t>
-      </w:r>
-      <w:r>
-        <w:rPr>
-          <w:b/>
-          <w:bCs/>
-          <w:color w:val="000000" w:themeColor="text1"/>
-          <w:sz w:val="26"/>
-          <w:szCs w:val="26"/>
-        </w:rPr>
-        <w:t xml:space="preserve">Detectar índices sin uso con </w:t>
+        <w:pStyle w:val="Ttulo3"/>
+        <w:rPr>
+          <w:lang w:val="es-MX"/>
+        </w:rPr>
+      </w:pPr>
+      <w:bookmarkStart w:id="31" w:name="_Toc225185341"/>
+      <w:r>
+        <w:t>2</w:t>
+      </w:r>
+      <w:r>
+        <w:t xml:space="preserve"> </w:t>
+      </w:r>
+      <w:proofErr w:type="gramStart"/>
+      <w:r>
+        <w:t>Detectar</w:t>
+      </w:r>
+      <w:proofErr w:type="gramEnd"/>
+      <w:r>
+        <w:t xml:space="preserve"> índices sin uso con </w:t>
       </w:r>
       <w:proofErr w:type="spellStart"/>
       <w:r>
-        <w:rPr>
-          <w:b/>
-          <w:bCs/>
-          <w:color w:val="000000" w:themeColor="text1"/>
-          <w:sz w:val="26"/>
-          <w:szCs w:val="26"/>
-        </w:rPr>
         <w:t>performance_schema</w:t>
       </w:r>
+      <w:bookmarkEnd w:id="31"/>
       <w:proofErr w:type="spellEnd"/>
     </w:p>
     <w:p>
@@ -16138,33 +17287,20 @@
     </w:p>
     <w:p>
       <w:pPr>
+        <w:pStyle w:val="Ttulo1"/>
+        <w:ind w:firstLine="0"/>
+      </w:pPr>
+      <w:bookmarkStart w:id="32" w:name="_Toc225185342"/>
+      <w:r>
+        <w:t>Práctica 5 — Roles y Privilegios de Almacenamiento en MySQL</w:t>
+      </w:r>
+      <w:bookmarkEnd w:id="32"/>
+    </w:p>
+    <w:p>
+      <w:pPr>
         <w:jc w:val="both"/>
         <w:rPr>
           <w:rFonts w:ascii="Verdana" w:hAnsi="Verdana"/>
-          <w:b/>
-          <w:bCs/>
-          <w:sz w:val="28"/>
-          <w:szCs w:val="24"/>
-          <w:lang w:val="es-MX"/>
-        </w:rPr>
-      </w:pPr>
-      <w:r>
-        <w:rPr>
-          <w:rFonts w:ascii="Verdana" w:hAnsi="Verdana"/>
-          <w:b/>
-          <w:bCs/>
-          <w:sz w:val="28"/>
-          <w:szCs w:val="24"/>
-          <w:lang w:val="es-MX"/>
-        </w:rPr>
-        <w:t>Práctica 5 — Roles y Privilegios de Almacenamiento en MySQL</w:t>
-      </w:r>
-    </w:p>
-    <w:p>
-      <w:pPr>
-        <w:jc w:val="both"/>
-        <w:rPr>
-          <w:rFonts w:ascii="Verdana" w:hAnsi="Verdana"/>
           <w:sz w:val="24"/>
           <w:szCs w:val="24"/>
           <w:lang w:val="es-MX"/>
@@ -16212,24 +17348,33 @@
     </w:p>
     <w:p>
       <w:pPr>
-        <w:rPr>
-          <w:rFonts w:ascii="Verdana" w:hAnsi="Verdana"/>
-          <w:b/>
-          <w:sz w:val="24"/>
-          <w:szCs w:val="24"/>
-          <w:lang w:val="es-MX"/>
-        </w:rPr>
-      </w:pPr>
-      <w:r>
-        <w:rPr>
-          <w:rFonts w:ascii="Verdana" w:hAnsi="Verdana"/>
-          <w:b/>
-          <w:sz w:val="24"/>
-          <w:szCs w:val="24"/>
-          <w:lang w:val="es-MX"/>
-        </w:rPr>
-        <w:t>PASO 1    Crear los roles de almacenamiento</w:t>
-      </w:r>
+        <w:pStyle w:val="Ttulo2"/>
+        <w:rPr>
+          <w:lang w:val="es-MX"/>
+        </w:rPr>
+      </w:pPr>
+      <w:bookmarkStart w:id="33" w:name="_Toc225185343"/>
+      <w:r>
+        <w:rPr>
+          <w:lang w:val="es-MX"/>
+        </w:rPr>
+        <w:t xml:space="preserve">1    </w:t>
+      </w:r>
+      <w:proofErr w:type="gramStart"/>
+      <w:r>
+        <w:rPr>
+          <w:lang w:val="es-MX"/>
+        </w:rPr>
+        <w:t>Crear</w:t>
+      </w:r>
+      <w:proofErr w:type="gramEnd"/>
+      <w:r>
+        <w:rPr>
+          <w:lang w:val="es-MX"/>
+        </w:rPr>
+        <w:t xml:space="preserve"> los roles de almacenamiento</w:t>
+      </w:r>
+      <w:bookmarkEnd w:id="33"/>
     </w:p>
     <w:p>
       <w:pPr>
@@ -16359,6 +17504,7 @@
           <w:szCs w:val="24"/>
           <w:lang w:val="es-MX" w:eastAsia="es-MX"/>
         </w:rPr>
+        <w:lastRenderedPageBreak/>
         <w:drawing>
           <wp:inline distT="0" distB="0" distL="0" distR="0" wp14:anchorId="001FD78F" wp14:editId="609D402B">
             <wp:extent cx="5220429" cy="2600688"/>
@@ -16497,6 +17643,78 @@
           <w:szCs w:val="24"/>
         </w:rPr>
       </w:pPr>
+    </w:p>
+    <w:p>
+      <w:pPr>
+        <w:rPr>
+          <w:rFonts w:ascii="Verdana" w:hAnsi="Verdana"/>
+          <w:sz w:val="24"/>
+          <w:szCs w:val="24"/>
+        </w:rPr>
+      </w:pPr>
+    </w:p>
+    <w:p>
+      <w:pPr>
+        <w:rPr>
+          <w:rFonts w:ascii="Verdana" w:hAnsi="Verdana"/>
+          <w:sz w:val="24"/>
+          <w:szCs w:val="24"/>
+        </w:rPr>
+      </w:pPr>
+    </w:p>
+    <w:p>
+      <w:pPr>
+        <w:rPr>
+          <w:rFonts w:ascii="Verdana" w:hAnsi="Verdana"/>
+          <w:sz w:val="24"/>
+          <w:szCs w:val="24"/>
+        </w:rPr>
+      </w:pPr>
+    </w:p>
+    <w:p>
+      <w:pPr>
+        <w:rPr>
+          <w:rFonts w:ascii="Verdana" w:hAnsi="Verdana"/>
+          <w:sz w:val="24"/>
+          <w:szCs w:val="24"/>
+        </w:rPr>
+      </w:pPr>
+    </w:p>
+    <w:p>
+      <w:pPr>
+        <w:rPr>
+          <w:rFonts w:ascii="Verdana" w:hAnsi="Verdana"/>
+          <w:sz w:val="24"/>
+          <w:szCs w:val="24"/>
+        </w:rPr>
+      </w:pPr>
+    </w:p>
+    <w:p>
+      <w:pPr>
+        <w:rPr>
+          <w:rFonts w:ascii="Verdana" w:hAnsi="Verdana"/>
+          <w:sz w:val="24"/>
+          <w:szCs w:val="24"/>
+        </w:rPr>
+      </w:pPr>
+    </w:p>
+    <w:p>
+      <w:pPr>
+        <w:rPr>
+          <w:rFonts w:ascii="Verdana" w:hAnsi="Verdana"/>
+          <w:sz w:val="24"/>
+          <w:szCs w:val="24"/>
+        </w:rPr>
+      </w:pPr>
+    </w:p>
+    <w:p>
+      <w:pPr>
+        <w:rPr>
+          <w:rFonts w:ascii="Verdana" w:hAnsi="Verdana"/>
+          <w:sz w:val="24"/>
+          <w:szCs w:val="24"/>
+        </w:rPr>
+      </w:pPr>
       <w:r>
         <w:rPr>
           <w:rFonts w:ascii="Verdana" w:hAnsi="Verdana"/>
@@ -17073,22 +18291,21 @@
     </w:p>
     <w:p>
       <w:pPr>
-        <w:rPr>
-          <w:rFonts w:ascii="Verdana" w:hAnsi="Verdana"/>
-          <w:b/>
-          <w:sz w:val="24"/>
-          <w:szCs w:val="24"/>
-        </w:rPr>
-      </w:pPr>
-      <w:r>
-        <w:rPr>
-          <w:rFonts w:ascii="Verdana" w:hAnsi="Verdana"/>
-          <w:b/>
-          <w:sz w:val="24"/>
-          <w:szCs w:val="24"/>
-        </w:rPr>
-        <w:t>PASO 2    Asignar roles a los usuarios</w:t>
-      </w:r>
+        <w:pStyle w:val="Ttulo2"/>
+      </w:pPr>
+      <w:bookmarkStart w:id="34" w:name="_Toc225185344"/>
+      <w:r>
+        <w:t xml:space="preserve">2    </w:t>
+      </w:r>
+      <w:proofErr w:type="gramStart"/>
+      <w:r>
+        <w:t>Asignar</w:t>
+      </w:r>
+      <w:proofErr w:type="gramEnd"/>
+      <w:r>
+        <w:t xml:space="preserve"> roles a los usuarios</w:t>
+      </w:r>
+      <w:bookmarkEnd w:id="34"/>
     </w:p>
     <w:p>
       <w:pPr>
@@ -17593,22 +18810,21 @@
     </w:p>
     <w:p>
       <w:pPr>
-        <w:rPr>
-          <w:rFonts w:ascii="Verdana" w:hAnsi="Verdana"/>
-          <w:b/>
-          <w:sz w:val="24"/>
-          <w:szCs w:val="24"/>
-        </w:rPr>
-      </w:pPr>
-      <w:r>
-        <w:rPr>
-          <w:rFonts w:ascii="Verdana" w:hAnsi="Verdana"/>
-          <w:b/>
-          <w:sz w:val="24"/>
-          <w:szCs w:val="24"/>
-        </w:rPr>
-        <w:t>PASO 3    Verificar roles y privilegios asignados</w:t>
-      </w:r>
+        <w:pStyle w:val="Ttulo2"/>
+      </w:pPr>
+      <w:bookmarkStart w:id="35" w:name="_Toc225185345"/>
+      <w:r>
+        <w:t xml:space="preserve">3    </w:t>
+      </w:r>
+      <w:proofErr w:type="gramStart"/>
+      <w:r>
+        <w:t>Verificar</w:t>
+      </w:r>
+      <w:proofErr w:type="gramEnd"/>
+      <w:r>
+        <w:t xml:space="preserve"> roles y privilegios asignados</w:t>
+      </w:r>
+      <w:bookmarkEnd w:id="35"/>
     </w:p>
     <w:p>
       <w:pPr>
@@ -17801,6 +19017,7 @@
           <w:szCs w:val="24"/>
           <w:lang w:val="es-MX" w:eastAsia="es-MX"/>
         </w:rPr>
+        <w:lastRenderedPageBreak/>
         <w:drawing>
           <wp:inline distT="0" distB="0" distL="0" distR="0" wp14:anchorId="1FD3110B" wp14:editId="7F41A2A4">
             <wp:extent cx="2743583" cy="3648584"/>
@@ -17909,6 +19126,86 @@
         <w:jc w:val="both"/>
         <w:rPr>
           <w:rFonts w:ascii="Verdana" w:hAnsi="Verdana"/>
+          <w:sz w:val="24"/>
+          <w:szCs w:val="24"/>
+        </w:rPr>
+      </w:pPr>
+    </w:p>
+    <w:p>
+      <w:pPr>
+        <w:jc w:val="both"/>
+        <w:rPr>
+          <w:rFonts w:ascii="Verdana" w:hAnsi="Verdana"/>
+          <w:sz w:val="24"/>
+          <w:szCs w:val="24"/>
+        </w:rPr>
+      </w:pPr>
+    </w:p>
+    <w:p>
+      <w:pPr>
+        <w:jc w:val="both"/>
+        <w:rPr>
+          <w:rFonts w:ascii="Verdana" w:hAnsi="Verdana"/>
+          <w:sz w:val="24"/>
+          <w:szCs w:val="24"/>
+        </w:rPr>
+      </w:pPr>
+    </w:p>
+    <w:p>
+      <w:pPr>
+        <w:jc w:val="both"/>
+        <w:rPr>
+          <w:rFonts w:ascii="Verdana" w:hAnsi="Verdana"/>
+          <w:sz w:val="24"/>
+          <w:szCs w:val="24"/>
+        </w:rPr>
+      </w:pPr>
+    </w:p>
+    <w:p>
+      <w:pPr>
+        <w:jc w:val="both"/>
+        <w:rPr>
+          <w:rFonts w:ascii="Verdana" w:hAnsi="Verdana"/>
+          <w:sz w:val="24"/>
+          <w:szCs w:val="24"/>
+        </w:rPr>
+      </w:pPr>
+    </w:p>
+    <w:p>
+      <w:pPr>
+        <w:jc w:val="both"/>
+        <w:rPr>
+          <w:rFonts w:ascii="Verdana" w:hAnsi="Verdana"/>
+          <w:sz w:val="24"/>
+          <w:szCs w:val="24"/>
+        </w:rPr>
+      </w:pPr>
+    </w:p>
+    <w:p>
+      <w:pPr>
+        <w:jc w:val="both"/>
+        <w:rPr>
+          <w:rFonts w:ascii="Verdana" w:hAnsi="Verdana"/>
+          <w:sz w:val="24"/>
+          <w:szCs w:val="24"/>
+        </w:rPr>
+      </w:pPr>
+    </w:p>
+    <w:p>
+      <w:pPr>
+        <w:jc w:val="both"/>
+        <w:rPr>
+          <w:rFonts w:ascii="Verdana" w:hAnsi="Verdana"/>
+          <w:sz w:val="24"/>
+          <w:szCs w:val="24"/>
+        </w:rPr>
+      </w:pPr>
+    </w:p>
+    <w:p>
+      <w:pPr>
+        <w:jc w:val="both"/>
+        <w:rPr>
+          <w:rFonts w:ascii="Verdana" w:hAnsi="Verdana"/>
           <w:b/>
           <w:sz w:val="32"/>
           <w:szCs w:val="24"/>
@@ -17921,6 +19218,7 @@
           <w:sz w:val="32"/>
           <w:szCs w:val="24"/>
         </w:rPr>
+        <w:lastRenderedPageBreak/>
         <w:t>Auditoria</w:t>
       </w:r>
     </w:p>
@@ -18186,14 +19484,159 @@
           <w:szCs w:val="24"/>
         </w:rPr>
       </w:pPr>
-      <w:r>
-        <w:rPr>
-          <w:rFonts w:ascii="Verdana" w:hAnsi="Verdana"/>
-          <w:sz w:val="24"/>
-          <w:szCs w:val="24"/>
-        </w:rPr>
-        <w:t>Hola brayan</w:t>
-      </w:r>
+    </w:p>
+    <w:p>
+      <w:pPr>
+        <w:rPr>
+          <w:rFonts w:ascii="Verdana" w:hAnsi="Verdana"/>
+          <w:sz w:val="24"/>
+          <w:szCs w:val="24"/>
+        </w:rPr>
+      </w:pPr>
+    </w:p>
+    <w:p>
+      <w:pPr>
+        <w:rPr>
+          <w:rFonts w:ascii="Verdana" w:hAnsi="Verdana"/>
+          <w:sz w:val="24"/>
+          <w:szCs w:val="24"/>
+        </w:rPr>
+      </w:pPr>
+    </w:p>
+    <w:p>
+      <w:pPr>
+        <w:rPr>
+          <w:rFonts w:ascii="Verdana" w:hAnsi="Verdana"/>
+          <w:sz w:val="24"/>
+          <w:szCs w:val="24"/>
+        </w:rPr>
+      </w:pPr>
+    </w:p>
+    <w:p>
+      <w:pPr>
+        <w:rPr>
+          <w:rFonts w:ascii="Verdana" w:hAnsi="Verdana"/>
+          <w:sz w:val="24"/>
+          <w:szCs w:val="24"/>
+        </w:rPr>
+      </w:pPr>
+    </w:p>
+    <w:p>
+      <w:pPr>
+        <w:pStyle w:val="Ttulo1"/>
+        <w:ind w:firstLine="0"/>
+      </w:pPr>
+      <w:r>
+        <w:t>Conclusión</w:t>
+      </w:r>
+    </w:p>
+    <w:p>
+      <w:pPr>
+        <w:rPr>
+          <w:rFonts w:ascii="Verdana" w:hAnsi="Verdana"/>
+          <w:sz w:val="24"/>
+          <w:szCs w:val="24"/>
+          <w:lang w:val="es-MX"/>
+        </w:rPr>
+      </w:pPr>
+      <w:r>
+        <w:rPr>
+          <w:rFonts w:ascii="Verdana" w:hAnsi="Verdana"/>
+          <w:sz w:val="24"/>
+          <w:szCs w:val="24"/>
+          <w:lang w:val="es-MX"/>
+        </w:rPr>
+        <w:t xml:space="preserve">En conclusión, la administración del espacio en disco en MySQL con el motor </w:t>
+      </w:r>
+      <w:proofErr w:type="spellStart"/>
+      <w:r>
+        <w:rPr>
+          <w:rFonts w:ascii="Verdana" w:hAnsi="Verdana"/>
+          <w:sz w:val="24"/>
+          <w:szCs w:val="24"/>
+          <w:lang w:val="es-MX"/>
+        </w:rPr>
+        <w:t>InnoDB</w:t>
+      </w:r>
+      <w:proofErr w:type="spellEnd"/>
+      <w:r>
+        <w:rPr>
+          <w:rFonts w:ascii="Verdana" w:hAnsi="Verdana"/>
+          <w:sz w:val="24"/>
+          <w:szCs w:val="24"/>
+          <w:lang w:val="es-MX"/>
+        </w:rPr>
+        <w:t xml:space="preserve"> representa un proceso integral que combina configuración, monitoreo, optimización y control de acceso. A través de las prácticas desarrolladas, se demuestra que, aunque MySQL no cuenta con ciertas funcionalidades avanzadas como cuotas nativas de almacenamiento, es posible implementar soluciones eficientes mediante el uso de </w:t>
+      </w:r>
+      <w:proofErr w:type="spellStart"/>
+      <w:r>
+        <w:rPr>
+          <w:rFonts w:ascii="Verdana" w:hAnsi="Verdana"/>
+          <w:sz w:val="24"/>
+          <w:szCs w:val="24"/>
+          <w:lang w:val="es-MX"/>
+        </w:rPr>
+        <w:t>tablespaces</w:t>
+      </w:r>
+      <w:proofErr w:type="spellEnd"/>
+      <w:r>
+        <w:rPr>
+          <w:rFonts w:ascii="Verdana" w:hAnsi="Verdana"/>
+          <w:sz w:val="24"/>
+          <w:szCs w:val="24"/>
+          <w:lang w:val="es-MX"/>
+        </w:rPr>
+        <w:t>, particionamiento de tablas, monitoreo con herramientas del sistema y mantenimiento periódico. Estas estrategias permiten no solo optimizar el uso del espacio, sino también mejorar significativamente el rendimiento general del sistema.</w:t>
+      </w:r>
+    </w:p>
+    <w:p>
+      <w:pPr>
+        <w:rPr>
+          <w:rFonts w:ascii="Verdana" w:hAnsi="Verdana"/>
+          <w:sz w:val="24"/>
+          <w:szCs w:val="24"/>
+          <w:lang w:val="es-MX"/>
+        </w:rPr>
+      </w:pPr>
+      <w:r>
+        <w:rPr>
+          <w:rFonts w:ascii="Verdana" w:hAnsi="Verdana"/>
+          <w:sz w:val="24"/>
+          <w:szCs w:val="24"/>
+          <w:lang w:val="es-MX"/>
+        </w:rPr>
+        <w:t>Un aspecto clave observado es la importancia del monitoreo constante del espacio utilizado por bases de datos, tablas e índices. La identificación de fragmentación y el uso de comandos como OPTIMIZE TABLE permiten recuperar espacio desperdiciado, mientras que la eliminación de índices no utilizados contribuye a reducir el tamaño total de almacenamiento. Asimismo, el particionamiento de tablas se presenta como una solución poderosa para manejar grandes volúmenes de datos, facilitando tanto las consultas como el mantenimiento.</w:t>
+      </w:r>
+    </w:p>
+    <w:p>
+      <w:pPr>
+        <w:rPr>
+          <w:rFonts w:ascii="Verdana" w:hAnsi="Verdana"/>
+          <w:sz w:val="24"/>
+          <w:szCs w:val="24"/>
+          <w:lang w:val="es-MX"/>
+        </w:rPr>
+      </w:pPr>
+      <w:r>
+        <w:rPr>
+          <w:rFonts w:ascii="Verdana" w:hAnsi="Verdana"/>
+          <w:sz w:val="24"/>
+          <w:szCs w:val="24"/>
+          <w:lang w:val="es-MX"/>
+        </w:rPr>
+        <w:t>Por otro lado, el uso de roles y privilegios introduce un enfoque de seguridad basado en el principio de mínimo privilegio, lo que ayuda a prevenir errores y accesos indebidos que puedan afectar la integridad o el almacenamiento de la base de datos. Esto es especialmente importante en entornos empresariales donde múltiples usuarios interactúan con la información.</w:t>
+      </w:r>
+    </w:p>
+    <w:p>
+      <w:pPr>
+        <w:rPr>
+          <w:rFonts w:ascii="Verdana" w:hAnsi="Verdana"/>
+          <w:sz w:val="24"/>
+          <w:szCs w:val="24"/>
+          <w:u w:val="single"/>
+          <w:lang w:val="es-MX"/>
+        </w:rPr>
+      </w:pPr>
     </w:p>
     <w:sectPr>
       <w:headerReference w:type="default" r:id="rId66"/>

</xml_diff>